<commit_message>
docs: separa inversion (servicios vs terceros), aclara correo/hospedaje gratis, detalla GBP, corrige punto 7 y agrega firma CEO + soyaimarktech.com
</commit_message>
<xml_diff>
--- a/propuesta/Propuesta_Presencia_Digital_Lopez_Sealcoating.docx
+++ b/propuesta/Propuesta_Presencia_Digital_Lopez_Sealcoating.docx
@@ -157,7 +157,44 @@
                 <w:color w:val="1A1A1A"/>
                 <w:sz w:val="21"/>
               </w:rPr>
-              <w:t>Aimarktech</w:t>
+              <w:t>Antonio Aguilar — CEO, Aimarktech</w:t>
+            </w:r>
+          </w:p>
+        </w:tc>
+      </w:tr>
+      <w:tr>
+        <w:tc>
+          <w:tcPr>
+            <w:tcW w:type="dxa" w:w="4816"/>
+            <w:shd w:val="clear" w:color="auto" w:fill="EDEDED"/>
+          </w:tcPr>
+          <w:p>
+            <w:r/>
+            <w:r>
+              <w:rPr>
+                <w:rFonts w:ascii="Calibri" w:hAnsi="Calibri"/>
+                <w:b/>
+                <w:color w:val="1A1A1A"/>
+                <w:sz w:val="21"/>
+              </w:rPr>
+              <w:t>Sitio web</w:t>
+            </w:r>
+          </w:p>
+        </w:tc>
+        <w:tc>
+          <w:tcPr>
+            <w:tcW w:type="dxa" w:w="4816"/>
+          </w:tcPr>
+          <w:p>
+            <w:r/>
+            <w:r>
+              <w:rPr>
+                <w:rFonts w:ascii="Calibri" w:hAnsi="Calibri"/>
+                <w:b w:val="0"/>
+                <w:color w:val="1A1A1A"/>
+                <w:sz w:val="21"/>
+              </w:rPr>
+              <w:t>www.soyaimarktech.com</w:t>
             </w:r>
           </w:p>
         </w:tc>
@@ -719,7 +756,7 @@
         <w:rPr>
           <w:sz w:val="22"/>
         </w:rPr>
-        <w:t>Correo profesional (ejemplo: info@lopezsealcoating.com) en lugar del Gmail.</w:t>
+        <w:t>Correo profesional (ejemplo: info@lopezsealcoating.com), configurado sin costo mensual, reenviando a tu correo actual.</w:t>
       </w:r>
     </w:p>
     <w:p>
@@ -758,6 +795,20 @@
           <w:sz w:val="22"/>
         </w:rPr>
         <w:t>Resultado: empiezas a aparecer en Google Maps y a acumular estrellas. Esto solo ya cambia el juego.</w:t>
+      </w:r>
+    </w:p>
+    <w:p>
+      <w:pPr>
+        <w:spacing w:after="120"/>
+      </w:pPr>
+      <w:r>
+        <w:rPr>
+          <w:b w:val="0"/>
+          <w:i w:val="0"/>
+          <w:color w:val="555555"/>
+          <w:sz w:val="20"/>
+        </w:rPr>
+        <w:t>Cómo implementamos el Perfil de Google (paso a paso): 1) creamos y reclamamos el perfil; 2) lo verificamos con Google (video/teléfono/tarjeta postal); 3) elegimos la categoría correcta (contratista de pavimento / sealcoating) y definimos tu zona de servicio por ciudades; 4) cargamos servicios, descripción bilingüe, fotos, logo y horario de temporada; 5) conectamos tu teléfono y el sitio web; 6) instalamos el sistema de reseñas y publicamos las primeras. Todo el perfil es gratuito en Google; se cobra el trabajo de armarlo y optimizarlo.</w:t>
       </w:r>
     </w:p>
     <w:p>
@@ -974,11 +1025,24 @@
       <w:r>
         <w:rPr>
           <w:b w:val="0"/>
-          <w:i/>
-          <w:color w:val="555555"/>
-          <w:sz w:val="20"/>
+          <w:i w:val="0"/>
+          <w:color w:val="1A1A1A"/>
+          <w:sz w:val="22"/>
         </w:rPr>
-        <w:t>Las siguientes cantidades son de referencia y se confirman al aprobar el alcance. Los montos de terceros (dominio, correo, presupuesto de anuncios) se pagan directamente a los proveedores.</w:t>
+        <w:t>Para que quede totalmente claro qué pagas y a quién, separamos la inversión en dos partes: (A) los servicios profesionales que realiza Aimarktech, y (B) los costos de terceros que se contratan a nombre de tu negocio (dominio, correo, hospedaje y, si decides, anuncios).</w:t>
+      </w:r>
+    </w:p>
+    <w:p>
+      <w:pPr>
+        <w:spacing w:before="120" w:after="40"/>
+      </w:pPr>
+      <w:r>
+        <w:rPr>
+          <w:b/>
+          <w:color w:val="1A1A1A"/>
+          <w:sz w:val="24"/>
+        </w:rPr>
+        <w:t>A) Servicios profesionales (los realiza Aimarktech)</w:t>
       </w:r>
     </w:p>
     <w:tbl>
@@ -1059,60 +1123,6 @@
         <w:tc>
           <w:tcPr>
             <w:tcW w:type="dxa" w:w="3211"/>
-            <w:shd w:val="clear" w:color="auto" w:fill="F5C400"/>
-          </w:tcPr>
-          <w:p>
-            <w:r/>
-            <w:r>
-              <w:rPr>
-                <w:rFonts w:ascii="Calibri" w:hAnsi="Calibri"/>
-                <w:b/>
-                <w:color w:val="1A1A1A"/>
-                <w:sz w:val="21"/>
-              </w:rPr>
-              <w:t>FASE 0 — Cimientos</w:t>
-            </w:r>
-          </w:p>
-        </w:tc>
-        <w:tc>
-          <w:tcPr>
-            <w:tcW w:type="dxa" w:w="3211"/>
-            <w:shd w:val="clear" w:color="auto" w:fill="F5C400"/>
-          </w:tcPr>
-          <w:p>
-            <w:r/>
-            <w:r>
-              <w:rPr>
-                <w:rFonts w:ascii="Calibri" w:hAnsi="Calibri"/>
-                <w:b w:val="0"/>
-                <w:color w:val="1A1A1A"/>
-                <w:sz w:val="21"/>
-              </w:rPr>
-            </w:r>
-          </w:p>
-        </w:tc>
-        <w:tc>
-          <w:tcPr>
-            <w:tcW w:type="dxa" w:w="3211"/>
-            <w:shd w:val="clear" w:color="auto" w:fill="F5C400"/>
-          </w:tcPr>
-          <w:p>
-            <w:r/>
-            <w:r>
-              <w:rPr>
-                <w:rFonts w:ascii="Calibri" w:hAnsi="Calibri"/>
-                <w:b w:val="0"/>
-                <w:color w:val="1A1A1A"/>
-                <w:sz w:val="21"/>
-              </w:rPr>
-            </w:r>
-          </w:p>
-        </w:tc>
-      </w:tr>
-      <w:tr>
-        <w:tc>
-          <w:tcPr>
-            <w:tcW w:type="dxa" w:w="3211"/>
           </w:tcPr>
           <w:p>
             <w:r/>
@@ -1164,124 +1174,6 @@
                 <w:sz w:val="21"/>
               </w:rPr>
               <w:t>$120 – $180</w:t>
-            </w:r>
-          </w:p>
-        </w:tc>
-      </w:tr>
-      <w:tr>
-        <w:tc>
-          <w:tcPr>
-            <w:tcW w:type="dxa" w:w="3211"/>
-          </w:tcPr>
-          <w:p>
-            <w:r/>
-            <w:r>
-              <w:rPr>
-                <w:rFonts w:ascii="Calibri" w:hAnsi="Calibri"/>
-                <w:b w:val="0"/>
-                <w:color w:val="1A1A1A"/>
-                <w:sz w:val="21"/>
-              </w:rPr>
-              <w:t>Registro de dominio (1 año)</w:t>
-            </w:r>
-          </w:p>
-        </w:tc>
-        <w:tc>
-          <w:tcPr>
-            <w:tcW w:type="dxa" w:w="3211"/>
-          </w:tcPr>
-          <w:p>
-            <w:pPr>
-              <w:jc w:val="center"/>
-            </w:pPr>
-            <w:r/>
-            <w:r>
-              <w:rPr>
-                <w:rFonts w:ascii="Calibri" w:hAnsi="Calibri"/>
-                <w:b w:val="0"/>
-                <w:color w:val="1A1A1A"/>
-                <w:sz w:val="21"/>
-              </w:rPr>
-              <w:t>Anual</w:t>
-            </w:r>
-          </w:p>
-        </w:tc>
-        <w:tc>
-          <w:tcPr>
-            <w:tcW w:type="dxa" w:w="3211"/>
-          </w:tcPr>
-          <w:p>
-            <w:pPr>
-              <w:jc w:val="center"/>
-            </w:pPr>
-            <w:r/>
-            <w:r>
-              <w:rPr>
-                <w:rFonts w:ascii="Calibri" w:hAnsi="Calibri"/>
-                <w:b w:val="0"/>
-                <w:color w:val="1A1A1A"/>
-                <w:sz w:val="21"/>
-              </w:rPr>
-              <w:t>$15 – $25</w:t>
-            </w:r>
-          </w:p>
-        </w:tc>
-      </w:tr>
-      <w:tr>
-        <w:tc>
-          <w:tcPr>
-            <w:tcW w:type="dxa" w:w="3211"/>
-          </w:tcPr>
-          <w:p>
-            <w:r/>
-            <w:r>
-              <w:rPr>
-                <w:rFonts w:ascii="Calibri" w:hAnsi="Calibri"/>
-                <w:b w:val="0"/>
-                <w:color w:val="1A1A1A"/>
-                <w:sz w:val="21"/>
-              </w:rPr>
-              <w:t>Correo profesional (1 año)</w:t>
-            </w:r>
-          </w:p>
-        </w:tc>
-        <w:tc>
-          <w:tcPr>
-            <w:tcW w:type="dxa" w:w="3211"/>
-          </w:tcPr>
-          <w:p>
-            <w:pPr>
-              <w:jc w:val="center"/>
-            </w:pPr>
-            <w:r/>
-            <w:r>
-              <w:rPr>
-                <w:rFonts w:ascii="Calibri" w:hAnsi="Calibri"/>
-                <w:b w:val="0"/>
-                <w:color w:val="1A1A1A"/>
-                <w:sz w:val="21"/>
-              </w:rPr>
-              <w:t>Anual</w:t>
-            </w:r>
-          </w:p>
-        </w:tc>
-        <w:tc>
-          <w:tcPr>
-            <w:tcW w:type="dxa" w:w="3211"/>
-          </w:tcPr>
-          <w:p>
-            <w:pPr>
-              <w:jc w:val="center"/>
-            </w:pPr>
-            <w:r/>
-            <w:r>
-              <w:rPr>
-                <w:rFonts w:ascii="Calibri" w:hAnsi="Calibri"/>
-                <w:b w:val="0"/>
-                <w:color w:val="1A1A1A"/>
-                <w:sz w:val="21"/>
-              </w:rPr>
-              <w:t>$40 – $70</w:t>
             </w:r>
           </w:p>
         </w:tc>
@@ -1408,25 +1300,6 @@
         <w:tc>
           <w:tcPr>
             <w:tcW w:type="dxa" w:w="3211"/>
-            <w:shd w:val="clear" w:color="auto" w:fill="F5C400"/>
-          </w:tcPr>
-          <w:p>
-            <w:r/>
-            <w:r>
-              <w:rPr>
-                <w:rFonts w:ascii="Calibri" w:hAnsi="Calibri"/>
-                <w:b/>
-                <w:color w:val="1A1A1A"/>
-                <w:sz w:val="21"/>
-              </w:rPr>
-              <w:t>FASE 1 — Sitio web de conversión</w:t>
-            </w:r>
-          </w:p>
-        </w:tc>
-        <w:tc>
-          <w:tcPr>
-            <w:tcW w:type="dxa" w:w="3211"/>
-            <w:shd w:val="clear" w:color="auto" w:fill="F5C400"/>
           </w:tcPr>
           <w:p>
             <w:r/>
@@ -1437,42 +1310,7 @@
                 <w:color w:val="1A1A1A"/>
                 <w:sz w:val="21"/>
               </w:rPr>
-            </w:r>
-          </w:p>
-        </w:tc>
-        <w:tc>
-          <w:tcPr>
-            <w:tcW w:type="dxa" w:w="3211"/>
-            <w:shd w:val="clear" w:color="auto" w:fill="F5C400"/>
-          </w:tcPr>
-          <w:p>
-            <w:r/>
-            <w:r>
-              <w:rPr>
-                <w:rFonts w:ascii="Calibri" w:hAnsi="Calibri"/>
-                <w:b w:val="0"/>
-                <w:color w:val="1A1A1A"/>
-                <w:sz w:val="21"/>
-              </w:rPr>
-            </w:r>
-          </w:p>
-        </w:tc>
-      </w:tr>
-      <w:tr>
-        <w:tc>
-          <w:tcPr>
-            <w:tcW w:type="dxa" w:w="3211"/>
-          </w:tcPr>
-          <w:p>
-            <w:r/>
-            <w:r>
-              <w:rPr>
-                <w:rFonts w:ascii="Calibri" w:hAnsi="Calibri"/>
-                <w:b w:val="0"/>
-                <w:color w:val="1A1A1A"/>
-                <w:sz w:val="21"/>
-              </w:rPr>
-              <w:t>Sitio bilingüe (EN/ES) de conversión</w:t>
+              <w:t>Sitio web bilingüe (EN/ES) de conversión</w:t>
             </w:r>
           </w:p>
         </w:tc>
@@ -1531,120 +1369,7 @@
                 <w:color w:val="1A1A1A"/>
                 <w:sz w:val="21"/>
               </w:rPr>
-              <w:t>Hospedaje del sitio (Cloudflare Pages)</w:t>
-            </w:r>
-          </w:p>
-        </w:tc>
-        <w:tc>
-          <w:tcPr>
-            <w:tcW w:type="dxa" w:w="3211"/>
-          </w:tcPr>
-          <w:p>
-            <w:pPr>
-              <w:jc w:val="center"/>
-            </w:pPr>
-            <w:r/>
-            <w:r>
-              <w:rPr>
-                <w:rFonts w:ascii="Calibri" w:hAnsi="Calibri"/>
-                <w:b w:val="0"/>
-                <w:color w:val="1A1A1A"/>
-                <w:sz w:val="21"/>
-              </w:rPr>
-              <w:t>Anual</w:t>
-            </w:r>
-          </w:p>
-        </w:tc>
-        <w:tc>
-          <w:tcPr>
-            <w:tcW w:type="dxa" w:w="3211"/>
-          </w:tcPr>
-          <w:p>
-            <w:pPr>
-              <w:jc w:val="center"/>
-            </w:pPr>
-            <w:r/>
-            <w:r>
-              <w:rPr>
-                <w:rFonts w:ascii="Calibri" w:hAnsi="Calibri"/>
-                <w:b w:val="0"/>
-                <w:color w:val="1A1A1A"/>
-                <w:sz w:val="21"/>
-              </w:rPr>
-              <w:t>$0 – $60</w:t>
-            </w:r>
-          </w:p>
-        </w:tc>
-      </w:tr>
-      <w:tr>
-        <w:tc>
-          <w:tcPr>
-            <w:tcW w:type="dxa" w:w="3211"/>
-            <w:shd w:val="clear" w:color="auto" w:fill="F5C400"/>
-          </w:tcPr>
-          <w:p>
-            <w:r/>
-            <w:r>
-              <w:rPr>
-                <w:rFonts w:ascii="Calibri" w:hAnsi="Calibri"/>
-                <w:b/>
-                <w:color w:val="1A1A1A"/>
-                <w:sz w:val="21"/>
-              </w:rPr>
-              <w:t>FASE 2 — Crecimiento (opcional)</w:t>
-            </w:r>
-          </w:p>
-        </w:tc>
-        <w:tc>
-          <w:tcPr>
-            <w:tcW w:type="dxa" w:w="3211"/>
-            <w:shd w:val="clear" w:color="auto" w:fill="F5C400"/>
-          </w:tcPr>
-          <w:p>
-            <w:r/>
-            <w:r>
-              <w:rPr>
-                <w:rFonts w:ascii="Calibri" w:hAnsi="Calibri"/>
-                <w:b w:val="0"/>
-                <w:color w:val="1A1A1A"/>
-                <w:sz w:val="21"/>
-              </w:rPr>
-            </w:r>
-          </w:p>
-        </w:tc>
-        <w:tc>
-          <w:tcPr>
-            <w:tcW w:type="dxa" w:w="3211"/>
-            <w:shd w:val="clear" w:color="auto" w:fill="F5C400"/>
-          </w:tcPr>
-          <w:p>
-            <w:r/>
-            <w:r>
-              <w:rPr>
-                <w:rFonts w:ascii="Calibri" w:hAnsi="Calibri"/>
-                <w:b w:val="0"/>
-                <w:color w:val="1A1A1A"/>
-                <w:sz w:val="21"/>
-              </w:rPr>
-            </w:r>
-          </w:p>
-        </w:tc>
-      </w:tr>
-      <w:tr>
-        <w:tc>
-          <w:tcPr>
-            <w:tcW w:type="dxa" w:w="3211"/>
-          </w:tcPr>
-          <w:p>
-            <w:r/>
-            <w:r>
-              <w:rPr>
-                <w:rFonts w:ascii="Calibri" w:hAnsi="Calibri"/>
-                <w:b w:val="0"/>
-                <w:color w:val="1A1A1A"/>
-                <w:sz w:val="21"/>
-              </w:rPr>
-              <w:t>Gestión de anuncios (mensual)</w:t>
+              <w:t>Gestión de anuncios (opcional, Fase 2)</w:t>
             </w:r>
           </w:p>
         </w:tc>
@@ -1689,6 +1414,108 @@
           </w:p>
         </w:tc>
       </w:tr>
+    </w:tbl>
+    <w:p>
+      <w:pPr>
+        <w:spacing w:after="120"/>
+      </w:pPr>
+      <w:r>
+        <w:rPr>
+          <w:b w:val="0"/>
+          <w:i w:val="0"/>
+          <w:color w:val="555555"/>
+          <w:sz w:val="20"/>
+        </w:rPr>
+        <w:t>Son honorarios por el trabajo profesional. El Perfil de Empresa en Google es gratuito por parte de Google; lo que se cobra es la creación, verificación y optimización del perfil.</w:t>
+      </w:r>
+    </w:p>
+    <w:p>
+      <w:pPr>
+        <w:spacing w:before="120" w:after="40"/>
+      </w:pPr>
+      <w:r>
+        <w:rPr>
+          <w:b/>
+          <w:color w:val="1A1A1A"/>
+          <w:sz w:val="24"/>
+        </w:rPr>
+        <w:t>B) Costos de terceros (a nombre de tu negocio)</w:t>
+      </w:r>
+    </w:p>
+    <w:tbl>
+      <w:tblPr>
+        <w:tblStyle w:val="TableGrid"/>
+        <w:tblW w:type="auto" w:w="0"/>
+        <w:jc w:val="center"/>
+        <w:tblLook w:firstColumn="1" w:firstRow="1" w:lastColumn="0" w:lastRow="0" w:noHBand="0" w:noVBand="1" w:val="04A0"/>
+      </w:tblPr>
+      <w:tblGrid>
+        <w:gridCol w:w="3211"/>
+        <w:gridCol w:w="3211"/>
+        <w:gridCol w:w="3211"/>
+      </w:tblGrid>
+      <w:tr>
+        <w:tc>
+          <w:tcPr>
+            <w:tcW w:type="dxa" w:w="3211"/>
+            <w:shd w:val="clear" w:color="auto" w:fill="1A1A1A"/>
+          </w:tcPr>
+          <w:p>
+            <w:r/>
+            <w:r>
+              <w:rPr>
+                <w:rFonts w:ascii="Calibri" w:hAnsi="Calibri"/>
+                <w:b/>
+                <w:color w:val="FFFFFF"/>
+                <w:sz w:val="22"/>
+              </w:rPr>
+              <w:t>Concepto</w:t>
+            </w:r>
+          </w:p>
+        </w:tc>
+        <w:tc>
+          <w:tcPr>
+            <w:tcW w:type="dxa" w:w="3211"/>
+            <w:shd w:val="clear" w:color="auto" w:fill="1A1A1A"/>
+          </w:tcPr>
+          <w:p>
+            <w:pPr>
+              <w:jc w:val="center"/>
+            </w:pPr>
+            <w:r/>
+            <w:r>
+              <w:rPr>
+                <w:rFonts w:ascii="Calibri" w:hAnsi="Calibri"/>
+                <w:b/>
+                <w:color w:val="FFFFFF"/>
+                <w:sz w:val="22"/>
+              </w:rPr>
+              <w:t>Tipo</w:t>
+            </w:r>
+          </w:p>
+        </w:tc>
+        <w:tc>
+          <w:tcPr>
+            <w:tcW w:type="dxa" w:w="3211"/>
+            <w:shd w:val="clear" w:color="auto" w:fill="1A1A1A"/>
+          </w:tcPr>
+          <w:p>
+            <w:pPr>
+              <w:jc w:val="center"/>
+            </w:pPr>
+            <w:r/>
+            <w:r>
+              <w:rPr>
+                <w:rFonts w:ascii="Calibri" w:hAnsi="Calibri"/>
+                <w:b/>
+                <w:color w:val="FFFFFF"/>
+                <w:sz w:val="22"/>
+              </w:rPr>
+              <w:t>Costo (USD)</w:t>
+            </w:r>
+          </w:p>
+        </w:tc>
+      </w:tr>
       <w:tr>
         <w:tc>
           <w:tcPr>
@@ -1703,7 +1530,243 @@
                 <w:color w:val="1A1A1A"/>
                 <w:sz w:val="21"/>
               </w:rPr>
-              <w:t>Presupuesto de anuncios (se paga a Google/Meta)</w:t>
+              <w:t>Dominio .com (registrador a costo, ej. Cloudflare)</w:t>
+            </w:r>
+          </w:p>
+        </w:tc>
+        <w:tc>
+          <w:tcPr>
+            <w:tcW w:type="dxa" w:w="3211"/>
+          </w:tcPr>
+          <w:p>
+            <w:pPr>
+              <w:jc w:val="center"/>
+            </w:pPr>
+            <w:r/>
+            <w:r>
+              <w:rPr>
+                <w:rFonts w:ascii="Calibri" w:hAnsi="Calibri"/>
+                <w:b w:val="0"/>
+                <w:color w:val="1A1A1A"/>
+                <w:sz w:val="21"/>
+              </w:rPr>
+              <w:t>Anual</w:t>
+            </w:r>
+          </w:p>
+        </w:tc>
+        <w:tc>
+          <w:tcPr>
+            <w:tcW w:type="dxa" w:w="3211"/>
+          </w:tcPr>
+          <w:p>
+            <w:pPr>
+              <w:jc w:val="center"/>
+            </w:pPr>
+            <w:r/>
+            <w:r>
+              <w:rPr>
+                <w:rFonts w:ascii="Calibri" w:hAnsi="Calibri"/>
+                <w:b w:val="0"/>
+                <w:color w:val="1A1A1A"/>
+                <w:sz w:val="21"/>
+              </w:rPr>
+              <w:t>$10 – $15</w:t>
+            </w:r>
+          </w:p>
+        </w:tc>
+      </w:tr>
+      <w:tr>
+        <w:tc>
+          <w:tcPr>
+            <w:tcW w:type="dxa" w:w="3211"/>
+          </w:tcPr>
+          <w:p>
+            <w:r/>
+            <w:r>
+              <w:rPr>
+                <w:rFonts w:ascii="Calibri" w:hAnsi="Calibri"/>
+                <w:b w:val="0"/>
+                <w:color w:val="1A1A1A"/>
+                <w:sz w:val="21"/>
+              </w:rPr>
+              <w:t>Correo profesional (opción sin costo mensual)</w:t>
+            </w:r>
+          </w:p>
+        </w:tc>
+        <w:tc>
+          <w:tcPr>
+            <w:tcW w:type="dxa" w:w="3211"/>
+          </w:tcPr>
+          <w:p>
+            <w:pPr>
+              <w:jc w:val="center"/>
+            </w:pPr>
+            <w:r/>
+            <w:r>
+              <w:rPr>
+                <w:rFonts w:ascii="Calibri" w:hAnsi="Calibri"/>
+                <w:b w:val="0"/>
+                <w:color w:val="1A1A1A"/>
+                <w:sz w:val="21"/>
+              </w:rPr>
+              <w:t>Anual</w:t>
+            </w:r>
+          </w:p>
+        </w:tc>
+        <w:tc>
+          <w:tcPr>
+            <w:tcW w:type="dxa" w:w="3211"/>
+          </w:tcPr>
+          <w:p>
+            <w:pPr>
+              <w:jc w:val="center"/>
+            </w:pPr>
+            <w:r/>
+            <w:r>
+              <w:rPr>
+                <w:rFonts w:ascii="Calibri" w:hAnsi="Calibri"/>
+                <w:b w:val="0"/>
+                <w:color w:val="1A1A1A"/>
+                <w:sz w:val="21"/>
+              </w:rPr>
+              <w:t>$0</w:t>
+            </w:r>
+          </w:p>
+        </w:tc>
+      </w:tr>
+      <w:tr>
+        <w:tc>
+          <w:tcPr>
+            <w:tcW w:type="dxa" w:w="3211"/>
+          </w:tcPr>
+          <w:p>
+            <w:r/>
+            <w:r>
+              <w:rPr>
+                <w:rFonts w:ascii="Calibri" w:hAnsi="Calibri"/>
+                <w:b w:val="0"/>
+                <w:color w:val="1A1A1A"/>
+                <w:sz w:val="21"/>
+              </w:rPr>
+              <w:t>Correo con buzón completo (Google Workspace, opcional)</w:t>
+            </w:r>
+          </w:p>
+        </w:tc>
+        <w:tc>
+          <w:tcPr>
+            <w:tcW w:type="dxa" w:w="3211"/>
+          </w:tcPr>
+          <w:p>
+            <w:pPr>
+              <w:jc w:val="center"/>
+            </w:pPr>
+            <w:r/>
+            <w:r>
+              <w:rPr>
+                <w:rFonts w:ascii="Calibri" w:hAnsi="Calibri"/>
+                <w:b w:val="0"/>
+                <w:color w:val="1A1A1A"/>
+                <w:sz w:val="21"/>
+              </w:rPr>
+              <w:t>Mensual</w:t>
+            </w:r>
+          </w:p>
+        </w:tc>
+        <w:tc>
+          <w:tcPr>
+            <w:tcW w:type="dxa" w:w="3211"/>
+          </w:tcPr>
+          <w:p>
+            <w:pPr>
+              <w:jc w:val="center"/>
+            </w:pPr>
+            <w:r/>
+            <w:r>
+              <w:rPr>
+                <w:rFonts w:ascii="Calibri" w:hAnsi="Calibri"/>
+                <w:b w:val="0"/>
+                <w:color w:val="1A1A1A"/>
+                <w:sz w:val="21"/>
+              </w:rPr>
+              <w:t>≈ $7 / mes</w:t>
+            </w:r>
+          </w:p>
+        </w:tc>
+      </w:tr>
+      <w:tr>
+        <w:tc>
+          <w:tcPr>
+            <w:tcW w:type="dxa" w:w="3211"/>
+          </w:tcPr>
+          <w:p>
+            <w:r/>
+            <w:r>
+              <w:rPr>
+                <w:rFonts w:ascii="Calibri" w:hAnsi="Calibri"/>
+                <w:b w:val="0"/>
+                <w:color w:val="1A1A1A"/>
+                <w:sz w:val="21"/>
+              </w:rPr>
+              <w:t>Hospedaje del sitio (Cloudflare Pages)</w:t>
+            </w:r>
+          </w:p>
+        </w:tc>
+        <w:tc>
+          <w:tcPr>
+            <w:tcW w:type="dxa" w:w="3211"/>
+          </w:tcPr>
+          <w:p>
+            <w:pPr>
+              <w:jc w:val="center"/>
+            </w:pPr>
+            <w:r/>
+            <w:r>
+              <w:rPr>
+                <w:rFonts w:ascii="Calibri" w:hAnsi="Calibri"/>
+                <w:b w:val="0"/>
+                <w:color w:val="1A1A1A"/>
+                <w:sz w:val="21"/>
+              </w:rPr>
+              <w:t>—</w:t>
+            </w:r>
+          </w:p>
+        </w:tc>
+        <w:tc>
+          <w:tcPr>
+            <w:tcW w:type="dxa" w:w="3211"/>
+          </w:tcPr>
+          <w:p>
+            <w:pPr>
+              <w:jc w:val="center"/>
+            </w:pPr>
+            <w:r/>
+            <w:r>
+              <w:rPr>
+                <w:rFonts w:ascii="Calibri" w:hAnsi="Calibri"/>
+                <w:b w:val="0"/>
+                <w:color w:val="1A1A1A"/>
+                <w:sz w:val="21"/>
+              </w:rPr>
+              <w:t>$0 (gratis)</w:t>
+            </w:r>
+          </w:p>
+        </w:tc>
+      </w:tr>
+      <w:tr>
+        <w:tc>
+          <w:tcPr>
+            <w:tcW w:type="dxa" w:w="3211"/>
+          </w:tcPr>
+          <w:p>
+            <w:r/>
+            <w:r>
+              <w:rPr>
+                <w:rFonts w:ascii="Calibri" w:hAnsi="Calibri"/>
+                <w:b w:val="0"/>
+                <w:color w:val="1A1A1A"/>
+                <w:sz w:val="21"/>
+              </w:rPr>
+              <w:t>Presupuesto de anuncios (opcional, Fase 2)</w:t>
             </w:r>
           </w:p>
         </w:tc>
@@ -1749,7 +1812,6 @@
         </w:tc>
       </w:tr>
     </w:tbl>
-    <w:p/>
     <w:p>
       <w:pPr>
         <w:spacing w:after="120"/>
@@ -1761,7 +1823,21 @@
           <w:color w:val="555555"/>
           <w:sz w:val="20"/>
         </w:rPr>
-        <w:t>* Rangos de referencia ajustables por Aimarktech. Recomendación: comenzar con Fase 0 + Fase 1, que es la base que genera resultados con la inversión más contenida.</w:t>
+        <w:t>El hospedaje en Cloudflare Pages es gratuito (igual que en nuestros otros proyectos). El correo profesional lo dejamos sin costo mensual usando reenvío hacia tu correo actual; solo si prefieres un buzón completo tipo Google Workspace habría una mensualidad.</w:t>
+      </w:r>
+    </w:p>
+    <w:p>
+      <w:pPr>
+        <w:spacing w:after="120"/>
+      </w:pPr>
+      <w:r>
+        <w:rPr>
+          <w:b w:val="0"/>
+          <w:i w:val="0"/>
+          <w:color w:val="555555"/>
+          <w:sz w:val="20"/>
+        </w:rPr>
+        <w:t>* Rangos de referencia ajustables. Recomendación: comenzar con el paquete Fase 0 + Fase 1.</w:t>
       </w:r>
     </w:p>
     <w:p>
@@ -1800,7 +1876,7 @@
                 <w:color w:val="1A1A1A"/>
                 <w:sz w:val="21"/>
               </w:rPr>
-              <w:t>Fase 0 + Fase 1 (logo, dominio, correo, Google Business Profile, sistema de reseñas y sitio bilingüe de conversión). Es el conjunto mínimo que te hace visible y convierte visitas en llamadas.</w:t>
+              <w:t>Fase 0 + Fase 1: logo, Perfil de Empresa en Google, sistema de reseñas y sitio bilingüe de conversión. Costos de terceros mínimos: solo el dominio (~$10–$15 al año); correo y hospedaje sin costo mensual. Es el conjunto mínimo que te hace visible y convierte visitas en llamadas.</w:t>
             </w:r>
           </w:p>
         </w:tc>
@@ -1931,6 +2007,42 @@
         <w:rPr>
           <w:sz w:val="22"/>
         </w:rPr>
+        <w:t>El nombre de dominio que prefieres (por ejemplo, lopezsealcoating.com), para registrarlo a tu nombre.</w:t>
+      </w:r>
+    </w:p>
+    <w:p>
+      <w:pPr>
+        <w:pStyle w:val="ListBullet"/>
+        <w:spacing w:after="60"/>
+      </w:pPr>
+      <w:r>
+        <w:rPr>
+          <w:sz w:val="22"/>
+        </w:rPr>
+        <w:t>Confirmar el teléfono que se mostrará al público (actualmente 331-236-9387).</w:t>
+      </w:r>
+    </w:p>
+    <w:p>
+      <w:pPr>
+        <w:pStyle w:val="ListBullet"/>
+        <w:spacing w:after="60"/>
+      </w:pPr>
+      <w:r>
+        <w:rPr>
+          <w:sz w:val="22"/>
+        </w:rPr>
+        <w:t>El correo personal donde quieres recibir los mensajes MIENTRAS configuramos tu correo profesional nuevo.</w:t>
+      </w:r>
+    </w:p>
+    <w:p>
+      <w:pPr>
+        <w:pStyle w:val="ListBullet"/>
+        <w:spacing w:after="60"/>
+      </w:pPr>
+      <w:r>
+        <w:rPr>
+          <w:sz w:val="22"/>
+        </w:rPr>
         <w:t>Tus fotos y videos de trabajos terminados en buena calidad.</w:t>
       </w:r>
     </w:p>
@@ -1956,18 +2068,6 @@
           <w:sz w:val="22"/>
         </w:rPr>
         <w:t>Las ciudades/zonas donde más te interesa conseguir clientes.</w:t>
-      </w:r>
-    </w:p>
-    <w:p>
-      <w:pPr>
-        <w:pStyle w:val="ListBullet"/>
-        <w:spacing w:after="60"/>
-      </w:pPr>
-      <w:r>
-        <w:rPr>
-          <w:sz w:val="22"/>
-        </w:rPr>
-        <w:t>Tu teléfono y correo definitivos para el contacto público.</w:t>
       </w:r>
     </w:p>
     <w:tbl>
@@ -2199,6 +2299,58 @@
       </w:tr>
     </w:tbl>
     <w:p/>
+    <w:p>
+      <w:pPr>
+        <w:spacing w:after="200"/>
+      </w:pPr>
+      <w:r>
+        <w:rPr>
+          <w:b w:val="0"/>
+          <w:i w:val="0"/>
+          <w:color w:val="1A1A1A"/>
+          <w:sz w:val="22"/>
+        </w:rPr>
+        <w:t>Atentamente,</w:t>
+      </w:r>
+    </w:p>
+    <w:p>
+      <w:pPr>
+        <w:spacing w:after="0"/>
+      </w:pPr>
+      <w:r>
+        <w:rPr>
+          <w:b/>
+          <w:color w:val="1A1A1A"/>
+          <w:sz w:val="25"/>
+        </w:rPr>
+        <w:t>Antonio Aguilar</w:t>
+      </w:r>
+    </w:p>
+    <w:p>
+      <w:pPr>
+        <w:spacing w:after="0"/>
+      </w:pPr>
+      <w:r>
+        <w:rPr>
+          <w:color w:val="555555"/>
+          <w:sz w:val="22"/>
+        </w:rPr>
+        <w:t>CEO · Aimarktech</w:t>
+      </w:r>
+    </w:p>
+    <w:p>
+      <w:pPr>
+        <w:spacing w:after="200"/>
+      </w:pPr>
+      <w:r>
+        <w:rPr>
+          <w:b/>
+          <w:color w:val="1A1A1A"/>
+          <w:sz w:val="22"/>
+        </w:rPr>
+        <w:t>https://soyaimarktech.com</w:t>
+      </w:r>
+    </w:p>
     <w:tbl>
       <w:tblPr>
         <w:tblW w:type="auto" w:w="0"/>
@@ -2229,7 +2381,7 @@
           </w:p>
           <w:p>
             <w:pPr>
-              <w:spacing w:after="160"/>
+              <w:spacing w:after="40"/>
               <w:jc w:val="center"/>
             </w:pPr>
             <w:r>
@@ -2238,6 +2390,20 @@
                 <w:sz w:val="21"/>
               </w:rPr>
               <w:t>Gracias por tu confianza. Estamos listos para hacer crecer Lopez Sealcoating.</w:t>
+            </w:r>
+          </w:p>
+          <w:p>
+            <w:pPr>
+              <w:spacing w:after="160"/>
+              <w:jc w:val="center"/>
+            </w:pPr>
+            <w:r>
+              <w:rPr>
+                <w:b/>
+                <w:color w:val="F5C400"/>
+                <w:sz w:val="21"/>
+              </w:rPr>
+              <w:t>www.soyaimarktech.com</w:t>
             </w:r>
           </w:p>
         </w:tc>

</xml_diff>

<commit_message>
docs: propuesta corregida (v2) + nuevo plan estrategico con FODA, SEO local (Map Pack) y tablero de KPIs
</commit_message>
<xml_diff>
--- a/propuesta/Propuesta_Presencia_Digital_Lopez_Sealcoating.docx
+++ b/propuesta/Propuesta_Presencia_Digital_Lopez_Sealcoating.docx
@@ -157,7 +157,44 @@
                 <w:color w:val="1A1A1A"/>
                 <w:sz w:val="21"/>
               </w:rPr>
-              <w:t>Aimarktech</w:t>
+              <w:t>Antonio Aguilar — CEO, Aimarktech</w:t>
+            </w:r>
+          </w:p>
+        </w:tc>
+      </w:tr>
+      <w:tr>
+        <w:tc>
+          <w:tcPr>
+            <w:tcW w:type="dxa" w:w="4816"/>
+            <w:shd w:val="clear" w:color="auto" w:fill="EDEDED"/>
+          </w:tcPr>
+          <w:p>
+            <w:r/>
+            <w:r>
+              <w:rPr>
+                <w:rFonts w:ascii="Calibri" w:hAnsi="Calibri"/>
+                <w:b/>
+                <w:color w:val="1A1A1A"/>
+                <w:sz w:val="21"/>
+              </w:rPr>
+              <w:t>Sitio web</w:t>
+            </w:r>
+          </w:p>
+        </w:tc>
+        <w:tc>
+          <w:tcPr>
+            <w:tcW w:type="dxa" w:w="4816"/>
+          </w:tcPr>
+          <w:p>
+            <w:r/>
+            <w:r>
+              <w:rPr>
+                <w:rFonts w:ascii="Calibri" w:hAnsi="Calibri"/>
+                <w:b w:val="0"/>
+                <w:color w:val="1A1A1A"/>
+                <w:sz w:val="21"/>
+              </w:rPr>
+              <w:t>www.soyaimarktech.com</w:t>
             </w:r>
           </w:p>
         </w:tc>
@@ -719,7 +756,7 @@
         <w:rPr>
           <w:sz w:val="22"/>
         </w:rPr>
-        <w:t>Correo profesional (ejemplo: info@lopezsealcoating.com) en lugar del Gmail.</w:t>
+        <w:t>Correo profesional (ejemplo: info@lopezsealcoating.com), configurado sin costo mensual, reenviando a tu correo actual.</w:t>
       </w:r>
     </w:p>
     <w:p>
@@ -758,6 +795,20 @@
           <w:sz w:val="22"/>
         </w:rPr>
         <w:t>Resultado: empiezas a aparecer en Google Maps y a acumular estrellas. Esto solo ya cambia el juego.</w:t>
+      </w:r>
+    </w:p>
+    <w:p>
+      <w:pPr>
+        <w:spacing w:after="120"/>
+      </w:pPr>
+      <w:r>
+        <w:rPr>
+          <w:b w:val="0"/>
+          <w:i w:val="0"/>
+          <w:color w:val="555555"/>
+          <w:sz w:val="20"/>
+        </w:rPr>
+        <w:t>Cómo implementamos el Perfil de Google (paso a paso): 1) creamos y reclamamos el perfil; 2) lo verificamos con Google (video/teléfono/tarjeta postal); 3) elegimos la categoría correcta (contratista de pavimento / sealcoating) y definimos tu zona de servicio por ciudades; 4) cargamos servicios, descripción bilingüe, fotos, logo y horario de temporada; 5) conectamos tu teléfono y el sitio web; 6) instalamos el sistema de reseñas y publicamos las primeras. Todo el perfil es gratuito en Google; se cobra el trabajo de armarlo y optimizarlo.</w:t>
       </w:r>
     </w:p>
     <w:p>
@@ -974,11 +1025,24 @@
       <w:r>
         <w:rPr>
           <w:b w:val="0"/>
-          <w:i/>
-          <w:color w:val="555555"/>
-          <w:sz w:val="20"/>
+          <w:i w:val="0"/>
+          <w:color w:val="1A1A1A"/>
+          <w:sz w:val="22"/>
         </w:rPr>
-        <w:t>Las siguientes cantidades son de referencia y se confirman al aprobar el alcance. Los montos de terceros (dominio, correo, presupuesto de anuncios) se pagan directamente a los proveedores.</w:t>
+        <w:t>Para que quede totalmente claro qué pagas y a quién, separamos la inversión en dos partes: (A) los servicios profesionales que realiza Aimarktech, y (B) los costos de terceros que se contratan a nombre de tu negocio (dominio, correo, hospedaje y, si decides, anuncios).</w:t>
+      </w:r>
+    </w:p>
+    <w:p>
+      <w:pPr>
+        <w:spacing w:before="120" w:after="40"/>
+      </w:pPr>
+      <w:r>
+        <w:rPr>
+          <w:b/>
+          <w:color w:val="1A1A1A"/>
+          <w:sz w:val="24"/>
+        </w:rPr>
+        <w:t>A) Servicios profesionales (los realiza Aimarktech)</w:t>
       </w:r>
     </w:p>
     <w:tbl>
@@ -1059,60 +1123,6 @@
         <w:tc>
           <w:tcPr>
             <w:tcW w:type="dxa" w:w="3211"/>
-            <w:shd w:val="clear" w:color="auto" w:fill="F5C400"/>
-          </w:tcPr>
-          <w:p>
-            <w:r/>
-            <w:r>
-              <w:rPr>
-                <w:rFonts w:ascii="Calibri" w:hAnsi="Calibri"/>
-                <w:b/>
-                <w:color w:val="1A1A1A"/>
-                <w:sz w:val="21"/>
-              </w:rPr>
-              <w:t>FASE 0 — Cimientos</w:t>
-            </w:r>
-          </w:p>
-        </w:tc>
-        <w:tc>
-          <w:tcPr>
-            <w:tcW w:type="dxa" w:w="3211"/>
-            <w:shd w:val="clear" w:color="auto" w:fill="F5C400"/>
-          </w:tcPr>
-          <w:p>
-            <w:r/>
-            <w:r>
-              <w:rPr>
-                <w:rFonts w:ascii="Calibri" w:hAnsi="Calibri"/>
-                <w:b w:val="0"/>
-                <w:color w:val="1A1A1A"/>
-                <w:sz w:val="21"/>
-              </w:rPr>
-            </w:r>
-          </w:p>
-        </w:tc>
-        <w:tc>
-          <w:tcPr>
-            <w:tcW w:type="dxa" w:w="3211"/>
-            <w:shd w:val="clear" w:color="auto" w:fill="F5C400"/>
-          </w:tcPr>
-          <w:p>
-            <w:r/>
-            <w:r>
-              <w:rPr>
-                <w:rFonts w:ascii="Calibri" w:hAnsi="Calibri"/>
-                <w:b w:val="0"/>
-                <w:color w:val="1A1A1A"/>
-                <w:sz w:val="21"/>
-              </w:rPr>
-            </w:r>
-          </w:p>
-        </w:tc>
-      </w:tr>
-      <w:tr>
-        <w:tc>
-          <w:tcPr>
-            <w:tcW w:type="dxa" w:w="3211"/>
           </w:tcPr>
           <w:p>
             <w:r/>
@@ -1164,124 +1174,6 @@
                 <w:sz w:val="21"/>
               </w:rPr>
               <w:t>$120 – $180</w:t>
-            </w:r>
-          </w:p>
-        </w:tc>
-      </w:tr>
-      <w:tr>
-        <w:tc>
-          <w:tcPr>
-            <w:tcW w:type="dxa" w:w="3211"/>
-          </w:tcPr>
-          <w:p>
-            <w:r/>
-            <w:r>
-              <w:rPr>
-                <w:rFonts w:ascii="Calibri" w:hAnsi="Calibri"/>
-                <w:b w:val="0"/>
-                <w:color w:val="1A1A1A"/>
-                <w:sz w:val="21"/>
-              </w:rPr>
-              <w:t>Registro de dominio (1 año)</w:t>
-            </w:r>
-          </w:p>
-        </w:tc>
-        <w:tc>
-          <w:tcPr>
-            <w:tcW w:type="dxa" w:w="3211"/>
-          </w:tcPr>
-          <w:p>
-            <w:pPr>
-              <w:jc w:val="center"/>
-            </w:pPr>
-            <w:r/>
-            <w:r>
-              <w:rPr>
-                <w:rFonts w:ascii="Calibri" w:hAnsi="Calibri"/>
-                <w:b w:val="0"/>
-                <w:color w:val="1A1A1A"/>
-                <w:sz w:val="21"/>
-              </w:rPr>
-              <w:t>Anual</w:t>
-            </w:r>
-          </w:p>
-        </w:tc>
-        <w:tc>
-          <w:tcPr>
-            <w:tcW w:type="dxa" w:w="3211"/>
-          </w:tcPr>
-          <w:p>
-            <w:pPr>
-              <w:jc w:val="center"/>
-            </w:pPr>
-            <w:r/>
-            <w:r>
-              <w:rPr>
-                <w:rFonts w:ascii="Calibri" w:hAnsi="Calibri"/>
-                <w:b w:val="0"/>
-                <w:color w:val="1A1A1A"/>
-                <w:sz w:val="21"/>
-              </w:rPr>
-              <w:t>$15 – $25</w:t>
-            </w:r>
-          </w:p>
-        </w:tc>
-      </w:tr>
-      <w:tr>
-        <w:tc>
-          <w:tcPr>
-            <w:tcW w:type="dxa" w:w="3211"/>
-          </w:tcPr>
-          <w:p>
-            <w:r/>
-            <w:r>
-              <w:rPr>
-                <w:rFonts w:ascii="Calibri" w:hAnsi="Calibri"/>
-                <w:b w:val="0"/>
-                <w:color w:val="1A1A1A"/>
-                <w:sz w:val="21"/>
-              </w:rPr>
-              <w:t>Correo profesional (1 año)</w:t>
-            </w:r>
-          </w:p>
-        </w:tc>
-        <w:tc>
-          <w:tcPr>
-            <w:tcW w:type="dxa" w:w="3211"/>
-          </w:tcPr>
-          <w:p>
-            <w:pPr>
-              <w:jc w:val="center"/>
-            </w:pPr>
-            <w:r/>
-            <w:r>
-              <w:rPr>
-                <w:rFonts w:ascii="Calibri" w:hAnsi="Calibri"/>
-                <w:b w:val="0"/>
-                <w:color w:val="1A1A1A"/>
-                <w:sz w:val="21"/>
-              </w:rPr>
-              <w:t>Anual</w:t>
-            </w:r>
-          </w:p>
-        </w:tc>
-        <w:tc>
-          <w:tcPr>
-            <w:tcW w:type="dxa" w:w="3211"/>
-          </w:tcPr>
-          <w:p>
-            <w:pPr>
-              <w:jc w:val="center"/>
-            </w:pPr>
-            <w:r/>
-            <w:r>
-              <w:rPr>
-                <w:rFonts w:ascii="Calibri" w:hAnsi="Calibri"/>
-                <w:b w:val="0"/>
-                <w:color w:val="1A1A1A"/>
-                <w:sz w:val="21"/>
-              </w:rPr>
-              <w:t>$40 – $70</w:t>
             </w:r>
           </w:p>
         </w:tc>
@@ -1408,25 +1300,6 @@
         <w:tc>
           <w:tcPr>
             <w:tcW w:type="dxa" w:w="3211"/>
-            <w:shd w:val="clear" w:color="auto" w:fill="F5C400"/>
-          </w:tcPr>
-          <w:p>
-            <w:r/>
-            <w:r>
-              <w:rPr>
-                <w:rFonts w:ascii="Calibri" w:hAnsi="Calibri"/>
-                <w:b/>
-                <w:color w:val="1A1A1A"/>
-                <w:sz w:val="21"/>
-              </w:rPr>
-              <w:t>FASE 1 — Sitio web de conversión</w:t>
-            </w:r>
-          </w:p>
-        </w:tc>
-        <w:tc>
-          <w:tcPr>
-            <w:tcW w:type="dxa" w:w="3211"/>
-            <w:shd w:val="clear" w:color="auto" w:fill="F5C400"/>
           </w:tcPr>
           <w:p>
             <w:r/>
@@ -1437,42 +1310,7 @@
                 <w:color w:val="1A1A1A"/>
                 <w:sz w:val="21"/>
               </w:rPr>
-            </w:r>
-          </w:p>
-        </w:tc>
-        <w:tc>
-          <w:tcPr>
-            <w:tcW w:type="dxa" w:w="3211"/>
-            <w:shd w:val="clear" w:color="auto" w:fill="F5C400"/>
-          </w:tcPr>
-          <w:p>
-            <w:r/>
-            <w:r>
-              <w:rPr>
-                <w:rFonts w:ascii="Calibri" w:hAnsi="Calibri"/>
-                <w:b w:val="0"/>
-                <w:color w:val="1A1A1A"/>
-                <w:sz w:val="21"/>
-              </w:rPr>
-            </w:r>
-          </w:p>
-        </w:tc>
-      </w:tr>
-      <w:tr>
-        <w:tc>
-          <w:tcPr>
-            <w:tcW w:type="dxa" w:w="3211"/>
-          </w:tcPr>
-          <w:p>
-            <w:r/>
-            <w:r>
-              <w:rPr>
-                <w:rFonts w:ascii="Calibri" w:hAnsi="Calibri"/>
-                <w:b w:val="0"/>
-                <w:color w:val="1A1A1A"/>
-                <w:sz w:val="21"/>
-              </w:rPr>
-              <w:t>Sitio bilingüe (EN/ES) de conversión</w:t>
+              <w:t>Sitio web bilingüe (EN/ES) de conversión</w:t>
             </w:r>
           </w:p>
         </w:tc>
@@ -1531,120 +1369,7 @@
                 <w:color w:val="1A1A1A"/>
                 <w:sz w:val="21"/>
               </w:rPr>
-              <w:t>Hospedaje del sitio (Cloudflare Pages)</w:t>
-            </w:r>
-          </w:p>
-        </w:tc>
-        <w:tc>
-          <w:tcPr>
-            <w:tcW w:type="dxa" w:w="3211"/>
-          </w:tcPr>
-          <w:p>
-            <w:pPr>
-              <w:jc w:val="center"/>
-            </w:pPr>
-            <w:r/>
-            <w:r>
-              <w:rPr>
-                <w:rFonts w:ascii="Calibri" w:hAnsi="Calibri"/>
-                <w:b w:val="0"/>
-                <w:color w:val="1A1A1A"/>
-                <w:sz w:val="21"/>
-              </w:rPr>
-              <w:t>Anual</w:t>
-            </w:r>
-          </w:p>
-        </w:tc>
-        <w:tc>
-          <w:tcPr>
-            <w:tcW w:type="dxa" w:w="3211"/>
-          </w:tcPr>
-          <w:p>
-            <w:pPr>
-              <w:jc w:val="center"/>
-            </w:pPr>
-            <w:r/>
-            <w:r>
-              <w:rPr>
-                <w:rFonts w:ascii="Calibri" w:hAnsi="Calibri"/>
-                <w:b w:val="0"/>
-                <w:color w:val="1A1A1A"/>
-                <w:sz w:val="21"/>
-              </w:rPr>
-              <w:t>$0 – $60</w:t>
-            </w:r>
-          </w:p>
-        </w:tc>
-      </w:tr>
-      <w:tr>
-        <w:tc>
-          <w:tcPr>
-            <w:tcW w:type="dxa" w:w="3211"/>
-            <w:shd w:val="clear" w:color="auto" w:fill="F5C400"/>
-          </w:tcPr>
-          <w:p>
-            <w:r/>
-            <w:r>
-              <w:rPr>
-                <w:rFonts w:ascii="Calibri" w:hAnsi="Calibri"/>
-                <w:b/>
-                <w:color w:val="1A1A1A"/>
-                <w:sz w:val="21"/>
-              </w:rPr>
-              <w:t>FASE 2 — Crecimiento (opcional)</w:t>
-            </w:r>
-          </w:p>
-        </w:tc>
-        <w:tc>
-          <w:tcPr>
-            <w:tcW w:type="dxa" w:w="3211"/>
-            <w:shd w:val="clear" w:color="auto" w:fill="F5C400"/>
-          </w:tcPr>
-          <w:p>
-            <w:r/>
-            <w:r>
-              <w:rPr>
-                <w:rFonts w:ascii="Calibri" w:hAnsi="Calibri"/>
-                <w:b w:val="0"/>
-                <w:color w:val="1A1A1A"/>
-                <w:sz w:val="21"/>
-              </w:rPr>
-            </w:r>
-          </w:p>
-        </w:tc>
-        <w:tc>
-          <w:tcPr>
-            <w:tcW w:type="dxa" w:w="3211"/>
-            <w:shd w:val="clear" w:color="auto" w:fill="F5C400"/>
-          </w:tcPr>
-          <w:p>
-            <w:r/>
-            <w:r>
-              <w:rPr>
-                <w:rFonts w:ascii="Calibri" w:hAnsi="Calibri"/>
-                <w:b w:val="0"/>
-                <w:color w:val="1A1A1A"/>
-                <w:sz w:val="21"/>
-              </w:rPr>
-            </w:r>
-          </w:p>
-        </w:tc>
-      </w:tr>
-      <w:tr>
-        <w:tc>
-          <w:tcPr>
-            <w:tcW w:type="dxa" w:w="3211"/>
-          </w:tcPr>
-          <w:p>
-            <w:r/>
-            <w:r>
-              <w:rPr>
-                <w:rFonts w:ascii="Calibri" w:hAnsi="Calibri"/>
-                <w:b w:val="0"/>
-                <w:color w:val="1A1A1A"/>
-                <w:sz w:val="21"/>
-              </w:rPr>
-              <w:t>Gestión de anuncios (mensual)</w:t>
+              <w:t>Gestión de anuncios (opcional, Fase 2)</w:t>
             </w:r>
           </w:p>
         </w:tc>
@@ -1689,6 +1414,108 @@
           </w:p>
         </w:tc>
       </w:tr>
+    </w:tbl>
+    <w:p>
+      <w:pPr>
+        <w:spacing w:after="120"/>
+      </w:pPr>
+      <w:r>
+        <w:rPr>
+          <w:b w:val="0"/>
+          <w:i w:val="0"/>
+          <w:color w:val="555555"/>
+          <w:sz w:val="20"/>
+        </w:rPr>
+        <w:t>Son honorarios por el trabajo profesional. El Perfil de Empresa en Google es gratuito por parte de Google; lo que se cobra es la creación, verificación y optimización del perfil.</w:t>
+      </w:r>
+    </w:p>
+    <w:p>
+      <w:pPr>
+        <w:spacing w:before="120" w:after="40"/>
+      </w:pPr>
+      <w:r>
+        <w:rPr>
+          <w:b/>
+          <w:color w:val="1A1A1A"/>
+          <w:sz w:val="24"/>
+        </w:rPr>
+        <w:t>B) Costos de terceros (a nombre de tu negocio)</w:t>
+      </w:r>
+    </w:p>
+    <w:tbl>
+      <w:tblPr>
+        <w:tblStyle w:val="TableGrid"/>
+        <w:tblW w:type="auto" w:w="0"/>
+        <w:jc w:val="center"/>
+        <w:tblLook w:firstColumn="1" w:firstRow="1" w:lastColumn="0" w:lastRow="0" w:noHBand="0" w:noVBand="1" w:val="04A0"/>
+      </w:tblPr>
+      <w:tblGrid>
+        <w:gridCol w:w="3211"/>
+        <w:gridCol w:w="3211"/>
+        <w:gridCol w:w="3211"/>
+      </w:tblGrid>
+      <w:tr>
+        <w:tc>
+          <w:tcPr>
+            <w:tcW w:type="dxa" w:w="3211"/>
+            <w:shd w:val="clear" w:color="auto" w:fill="1A1A1A"/>
+          </w:tcPr>
+          <w:p>
+            <w:r/>
+            <w:r>
+              <w:rPr>
+                <w:rFonts w:ascii="Calibri" w:hAnsi="Calibri"/>
+                <w:b/>
+                <w:color w:val="FFFFFF"/>
+                <w:sz w:val="22"/>
+              </w:rPr>
+              <w:t>Concepto</w:t>
+            </w:r>
+          </w:p>
+        </w:tc>
+        <w:tc>
+          <w:tcPr>
+            <w:tcW w:type="dxa" w:w="3211"/>
+            <w:shd w:val="clear" w:color="auto" w:fill="1A1A1A"/>
+          </w:tcPr>
+          <w:p>
+            <w:pPr>
+              <w:jc w:val="center"/>
+            </w:pPr>
+            <w:r/>
+            <w:r>
+              <w:rPr>
+                <w:rFonts w:ascii="Calibri" w:hAnsi="Calibri"/>
+                <w:b/>
+                <w:color w:val="FFFFFF"/>
+                <w:sz w:val="22"/>
+              </w:rPr>
+              <w:t>Tipo</w:t>
+            </w:r>
+          </w:p>
+        </w:tc>
+        <w:tc>
+          <w:tcPr>
+            <w:tcW w:type="dxa" w:w="3211"/>
+            <w:shd w:val="clear" w:color="auto" w:fill="1A1A1A"/>
+          </w:tcPr>
+          <w:p>
+            <w:pPr>
+              <w:jc w:val="center"/>
+            </w:pPr>
+            <w:r/>
+            <w:r>
+              <w:rPr>
+                <w:rFonts w:ascii="Calibri" w:hAnsi="Calibri"/>
+                <w:b/>
+                <w:color w:val="FFFFFF"/>
+                <w:sz w:val="22"/>
+              </w:rPr>
+              <w:t>Costo (USD)</w:t>
+            </w:r>
+          </w:p>
+        </w:tc>
+      </w:tr>
       <w:tr>
         <w:tc>
           <w:tcPr>
@@ -1703,7 +1530,243 @@
                 <w:color w:val="1A1A1A"/>
                 <w:sz w:val="21"/>
               </w:rPr>
-              <w:t>Presupuesto de anuncios (se paga a Google/Meta)</w:t>
+              <w:t>Dominio .com (registrador a costo, ej. Cloudflare)</w:t>
+            </w:r>
+          </w:p>
+        </w:tc>
+        <w:tc>
+          <w:tcPr>
+            <w:tcW w:type="dxa" w:w="3211"/>
+          </w:tcPr>
+          <w:p>
+            <w:pPr>
+              <w:jc w:val="center"/>
+            </w:pPr>
+            <w:r/>
+            <w:r>
+              <w:rPr>
+                <w:rFonts w:ascii="Calibri" w:hAnsi="Calibri"/>
+                <w:b w:val="0"/>
+                <w:color w:val="1A1A1A"/>
+                <w:sz w:val="21"/>
+              </w:rPr>
+              <w:t>Anual</w:t>
+            </w:r>
+          </w:p>
+        </w:tc>
+        <w:tc>
+          <w:tcPr>
+            <w:tcW w:type="dxa" w:w="3211"/>
+          </w:tcPr>
+          <w:p>
+            <w:pPr>
+              <w:jc w:val="center"/>
+            </w:pPr>
+            <w:r/>
+            <w:r>
+              <w:rPr>
+                <w:rFonts w:ascii="Calibri" w:hAnsi="Calibri"/>
+                <w:b w:val="0"/>
+                <w:color w:val="1A1A1A"/>
+                <w:sz w:val="21"/>
+              </w:rPr>
+              <w:t>$10 – $15</w:t>
+            </w:r>
+          </w:p>
+        </w:tc>
+      </w:tr>
+      <w:tr>
+        <w:tc>
+          <w:tcPr>
+            <w:tcW w:type="dxa" w:w="3211"/>
+          </w:tcPr>
+          <w:p>
+            <w:r/>
+            <w:r>
+              <w:rPr>
+                <w:rFonts w:ascii="Calibri" w:hAnsi="Calibri"/>
+                <w:b w:val="0"/>
+                <w:color w:val="1A1A1A"/>
+                <w:sz w:val="21"/>
+              </w:rPr>
+              <w:t>Correo profesional (opción sin costo mensual)</w:t>
+            </w:r>
+          </w:p>
+        </w:tc>
+        <w:tc>
+          <w:tcPr>
+            <w:tcW w:type="dxa" w:w="3211"/>
+          </w:tcPr>
+          <w:p>
+            <w:pPr>
+              <w:jc w:val="center"/>
+            </w:pPr>
+            <w:r/>
+            <w:r>
+              <w:rPr>
+                <w:rFonts w:ascii="Calibri" w:hAnsi="Calibri"/>
+                <w:b w:val="0"/>
+                <w:color w:val="1A1A1A"/>
+                <w:sz w:val="21"/>
+              </w:rPr>
+              <w:t>Anual</w:t>
+            </w:r>
+          </w:p>
+        </w:tc>
+        <w:tc>
+          <w:tcPr>
+            <w:tcW w:type="dxa" w:w="3211"/>
+          </w:tcPr>
+          <w:p>
+            <w:pPr>
+              <w:jc w:val="center"/>
+            </w:pPr>
+            <w:r/>
+            <w:r>
+              <w:rPr>
+                <w:rFonts w:ascii="Calibri" w:hAnsi="Calibri"/>
+                <w:b w:val="0"/>
+                <w:color w:val="1A1A1A"/>
+                <w:sz w:val="21"/>
+              </w:rPr>
+              <w:t>$0</w:t>
+            </w:r>
+          </w:p>
+        </w:tc>
+      </w:tr>
+      <w:tr>
+        <w:tc>
+          <w:tcPr>
+            <w:tcW w:type="dxa" w:w="3211"/>
+          </w:tcPr>
+          <w:p>
+            <w:r/>
+            <w:r>
+              <w:rPr>
+                <w:rFonts w:ascii="Calibri" w:hAnsi="Calibri"/>
+                <w:b w:val="0"/>
+                <w:color w:val="1A1A1A"/>
+                <w:sz w:val="21"/>
+              </w:rPr>
+              <w:t>Correo con buzón completo (Google Workspace, opcional)</w:t>
+            </w:r>
+          </w:p>
+        </w:tc>
+        <w:tc>
+          <w:tcPr>
+            <w:tcW w:type="dxa" w:w="3211"/>
+          </w:tcPr>
+          <w:p>
+            <w:pPr>
+              <w:jc w:val="center"/>
+            </w:pPr>
+            <w:r/>
+            <w:r>
+              <w:rPr>
+                <w:rFonts w:ascii="Calibri" w:hAnsi="Calibri"/>
+                <w:b w:val="0"/>
+                <w:color w:val="1A1A1A"/>
+                <w:sz w:val="21"/>
+              </w:rPr>
+              <w:t>Mensual</w:t>
+            </w:r>
+          </w:p>
+        </w:tc>
+        <w:tc>
+          <w:tcPr>
+            <w:tcW w:type="dxa" w:w="3211"/>
+          </w:tcPr>
+          <w:p>
+            <w:pPr>
+              <w:jc w:val="center"/>
+            </w:pPr>
+            <w:r/>
+            <w:r>
+              <w:rPr>
+                <w:rFonts w:ascii="Calibri" w:hAnsi="Calibri"/>
+                <w:b w:val="0"/>
+                <w:color w:val="1A1A1A"/>
+                <w:sz w:val="21"/>
+              </w:rPr>
+              <w:t>≈ $7 / mes</w:t>
+            </w:r>
+          </w:p>
+        </w:tc>
+      </w:tr>
+      <w:tr>
+        <w:tc>
+          <w:tcPr>
+            <w:tcW w:type="dxa" w:w="3211"/>
+          </w:tcPr>
+          <w:p>
+            <w:r/>
+            <w:r>
+              <w:rPr>
+                <w:rFonts w:ascii="Calibri" w:hAnsi="Calibri"/>
+                <w:b w:val="0"/>
+                <w:color w:val="1A1A1A"/>
+                <w:sz w:val="21"/>
+              </w:rPr>
+              <w:t>Hospedaje del sitio (Cloudflare Pages)</w:t>
+            </w:r>
+          </w:p>
+        </w:tc>
+        <w:tc>
+          <w:tcPr>
+            <w:tcW w:type="dxa" w:w="3211"/>
+          </w:tcPr>
+          <w:p>
+            <w:pPr>
+              <w:jc w:val="center"/>
+            </w:pPr>
+            <w:r/>
+            <w:r>
+              <w:rPr>
+                <w:rFonts w:ascii="Calibri" w:hAnsi="Calibri"/>
+                <w:b w:val="0"/>
+                <w:color w:val="1A1A1A"/>
+                <w:sz w:val="21"/>
+              </w:rPr>
+              <w:t>—</w:t>
+            </w:r>
+          </w:p>
+        </w:tc>
+        <w:tc>
+          <w:tcPr>
+            <w:tcW w:type="dxa" w:w="3211"/>
+          </w:tcPr>
+          <w:p>
+            <w:pPr>
+              <w:jc w:val="center"/>
+            </w:pPr>
+            <w:r/>
+            <w:r>
+              <w:rPr>
+                <w:rFonts w:ascii="Calibri" w:hAnsi="Calibri"/>
+                <w:b w:val="0"/>
+                <w:color w:val="1A1A1A"/>
+                <w:sz w:val="21"/>
+              </w:rPr>
+              <w:t>$0 (gratis)</w:t>
+            </w:r>
+          </w:p>
+        </w:tc>
+      </w:tr>
+      <w:tr>
+        <w:tc>
+          <w:tcPr>
+            <w:tcW w:type="dxa" w:w="3211"/>
+          </w:tcPr>
+          <w:p>
+            <w:r/>
+            <w:r>
+              <w:rPr>
+                <w:rFonts w:ascii="Calibri" w:hAnsi="Calibri"/>
+                <w:b w:val="0"/>
+                <w:color w:val="1A1A1A"/>
+                <w:sz w:val="21"/>
+              </w:rPr>
+              <w:t>Presupuesto de anuncios (opcional, Fase 2)</w:t>
             </w:r>
           </w:p>
         </w:tc>
@@ -1749,7 +1812,6 @@
         </w:tc>
       </w:tr>
     </w:tbl>
-    <w:p/>
     <w:p>
       <w:pPr>
         <w:spacing w:after="120"/>
@@ -1761,7 +1823,21 @@
           <w:color w:val="555555"/>
           <w:sz w:val="20"/>
         </w:rPr>
-        <w:t>* Rangos de referencia ajustables por Aimarktech. Recomendación: comenzar con Fase 0 + Fase 1, que es la base que genera resultados con la inversión más contenida.</w:t>
+        <w:t>El hospedaje en Cloudflare Pages es gratuito (igual que en nuestros otros proyectos). El correo profesional lo dejamos sin costo mensual usando reenvío hacia tu correo actual; solo si prefieres un buzón completo tipo Google Workspace habría una mensualidad.</w:t>
+      </w:r>
+    </w:p>
+    <w:p>
+      <w:pPr>
+        <w:spacing w:after="120"/>
+      </w:pPr>
+      <w:r>
+        <w:rPr>
+          <w:b w:val="0"/>
+          <w:i w:val="0"/>
+          <w:color w:val="555555"/>
+          <w:sz w:val="20"/>
+        </w:rPr>
+        <w:t>* Rangos de referencia ajustables. Recomendación: comenzar con el paquete Fase 0 + Fase 1.</w:t>
       </w:r>
     </w:p>
     <w:p>
@@ -1800,7 +1876,7 @@
                 <w:color w:val="1A1A1A"/>
                 <w:sz w:val="21"/>
               </w:rPr>
-              <w:t>Fase 0 + Fase 1 (logo, dominio, correo, Google Business Profile, sistema de reseñas y sitio bilingüe de conversión). Es el conjunto mínimo que te hace visible y convierte visitas en llamadas.</w:t>
+              <w:t>Fase 0 + Fase 1: logo, Perfil de Empresa en Google, sistema de reseñas y sitio bilingüe de conversión. Costos de terceros mínimos: solo el dominio (~$10–$15 al año); correo y hospedaje sin costo mensual. Es el conjunto mínimo que te hace visible y convierte visitas en llamadas.</w:t>
             </w:r>
           </w:p>
         </w:tc>
@@ -1931,6 +2007,42 @@
         <w:rPr>
           <w:sz w:val="22"/>
         </w:rPr>
+        <w:t>El nombre de dominio que prefieres (por ejemplo, lopezsealcoating.com), para registrarlo a tu nombre.</w:t>
+      </w:r>
+    </w:p>
+    <w:p>
+      <w:pPr>
+        <w:pStyle w:val="ListBullet"/>
+        <w:spacing w:after="60"/>
+      </w:pPr>
+      <w:r>
+        <w:rPr>
+          <w:sz w:val="22"/>
+        </w:rPr>
+        <w:t>Confirmar el teléfono que se mostrará al público (actualmente 331-236-9387).</w:t>
+      </w:r>
+    </w:p>
+    <w:p>
+      <w:pPr>
+        <w:pStyle w:val="ListBullet"/>
+        <w:spacing w:after="60"/>
+      </w:pPr>
+      <w:r>
+        <w:rPr>
+          <w:sz w:val="22"/>
+        </w:rPr>
+        <w:t>El correo personal donde quieres recibir los mensajes MIENTRAS configuramos tu correo profesional nuevo.</w:t>
+      </w:r>
+    </w:p>
+    <w:p>
+      <w:pPr>
+        <w:pStyle w:val="ListBullet"/>
+        <w:spacing w:after="60"/>
+      </w:pPr>
+      <w:r>
+        <w:rPr>
+          <w:sz w:val="22"/>
+        </w:rPr>
         <w:t>Tus fotos y videos de trabajos terminados en buena calidad.</w:t>
       </w:r>
     </w:p>
@@ -1956,18 +2068,6 @@
           <w:sz w:val="22"/>
         </w:rPr>
         <w:t>Las ciudades/zonas donde más te interesa conseguir clientes.</w:t>
-      </w:r>
-    </w:p>
-    <w:p>
-      <w:pPr>
-        <w:pStyle w:val="ListBullet"/>
-        <w:spacing w:after="60"/>
-      </w:pPr>
-      <w:r>
-        <w:rPr>
-          <w:sz w:val="22"/>
-        </w:rPr>
-        <w:t>Tu teléfono y correo definitivos para el contacto público.</w:t>
       </w:r>
     </w:p>
     <w:tbl>
@@ -2199,6 +2299,58 @@
       </w:tr>
     </w:tbl>
     <w:p/>
+    <w:p>
+      <w:pPr>
+        <w:spacing w:after="200"/>
+      </w:pPr>
+      <w:r>
+        <w:rPr>
+          <w:b w:val="0"/>
+          <w:i w:val="0"/>
+          <w:color w:val="1A1A1A"/>
+          <w:sz w:val="22"/>
+        </w:rPr>
+        <w:t>Atentamente,</w:t>
+      </w:r>
+    </w:p>
+    <w:p>
+      <w:pPr>
+        <w:spacing w:after="0"/>
+      </w:pPr>
+      <w:r>
+        <w:rPr>
+          <w:b/>
+          <w:color w:val="1A1A1A"/>
+          <w:sz w:val="25"/>
+        </w:rPr>
+        <w:t>Antonio Aguilar</w:t>
+      </w:r>
+    </w:p>
+    <w:p>
+      <w:pPr>
+        <w:spacing w:after="0"/>
+      </w:pPr>
+      <w:r>
+        <w:rPr>
+          <w:color w:val="555555"/>
+          <w:sz w:val="22"/>
+        </w:rPr>
+        <w:t>CEO · Aimarktech</w:t>
+      </w:r>
+    </w:p>
+    <w:p>
+      <w:pPr>
+        <w:spacing w:after="200"/>
+      </w:pPr>
+      <w:r>
+        <w:rPr>
+          <w:b/>
+          <w:color w:val="1A1A1A"/>
+          <w:sz w:val="22"/>
+        </w:rPr>
+        <w:t>https://soyaimarktech.com</w:t>
+      </w:r>
+    </w:p>
     <w:tbl>
       <w:tblPr>
         <w:tblW w:type="auto" w:w="0"/>
@@ -2229,7 +2381,7 @@
           </w:p>
           <w:p>
             <w:pPr>
-              <w:spacing w:after="160"/>
+              <w:spacing w:after="40"/>
               <w:jc w:val="center"/>
             </w:pPr>
             <w:r>
@@ -2238,6 +2390,20 @@
                 <w:sz w:val="21"/>
               </w:rPr>
               <w:t>Gracias por tu confianza. Estamos listos para hacer crecer Lopez Sealcoating.</w:t>
+            </w:r>
+          </w:p>
+          <w:p>
+            <w:pPr>
+              <w:spacing w:after="160"/>
+              <w:jc w:val="center"/>
+            </w:pPr>
+            <w:r>
+              <w:rPr>
+                <w:b/>
+                <w:color w:val="F5C400"/>
+                <w:sz w:val="21"/>
+              </w:rPr>
+              <w:t>www.soyaimarktech.com</w:t>
             </w:r>
           </w:p>
         </w:tc>

</xml_diff>

<commit_message>
Merge PR #3: propuesta v2 + plan estrategico
Co-authored-by: Kiro Agent <244629292+kiro-agent@users.noreply.github.com>
</commit_message>
<xml_diff>
--- a/propuesta/Propuesta_Presencia_Digital_Lopez_Sealcoating.docx
+++ b/propuesta/Propuesta_Presencia_Digital_Lopez_Sealcoating.docx
@@ -157,7 +157,44 @@
                 <w:color w:val="1A1A1A"/>
                 <w:sz w:val="21"/>
               </w:rPr>
-              <w:t>Aimarktech</w:t>
+              <w:t>Antonio Aguilar — CEO, Aimarktech</w:t>
+            </w:r>
+          </w:p>
+        </w:tc>
+      </w:tr>
+      <w:tr>
+        <w:tc>
+          <w:tcPr>
+            <w:tcW w:type="dxa" w:w="4816"/>
+            <w:shd w:val="clear" w:color="auto" w:fill="EDEDED"/>
+          </w:tcPr>
+          <w:p>
+            <w:r/>
+            <w:r>
+              <w:rPr>
+                <w:rFonts w:ascii="Calibri" w:hAnsi="Calibri"/>
+                <w:b/>
+                <w:color w:val="1A1A1A"/>
+                <w:sz w:val="21"/>
+              </w:rPr>
+              <w:t>Sitio web</w:t>
+            </w:r>
+          </w:p>
+        </w:tc>
+        <w:tc>
+          <w:tcPr>
+            <w:tcW w:type="dxa" w:w="4816"/>
+          </w:tcPr>
+          <w:p>
+            <w:r/>
+            <w:r>
+              <w:rPr>
+                <w:rFonts w:ascii="Calibri" w:hAnsi="Calibri"/>
+                <w:b w:val="0"/>
+                <w:color w:val="1A1A1A"/>
+                <w:sz w:val="21"/>
+              </w:rPr>
+              <w:t>www.soyaimarktech.com</w:t>
             </w:r>
           </w:p>
         </w:tc>
@@ -719,7 +756,7 @@
         <w:rPr>
           <w:sz w:val="22"/>
         </w:rPr>
-        <w:t>Correo profesional (ejemplo: info@lopezsealcoating.com) en lugar del Gmail.</w:t>
+        <w:t>Correo profesional (ejemplo: info@lopezsealcoating.com), configurado sin costo mensual, reenviando a tu correo actual.</w:t>
       </w:r>
     </w:p>
     <w:p>
@@ -758,6 +795,20 @@
           <w:sz w:val="22"/>
         </w:rPr>
         <w:t>Resultado: empiezas a aparecer en Google Maps y a acumular estrellas. Esto solo ya cambia el juego.</w:t>
+      </w:r>
+    </w:p>
+    <w:p>
+      <w:pPr>
+        <w:spacing w:after="120"/>
+      </w:pPr>
+      <w:r>
+        <w:rPr>
+          <w:b w:val="0"/>
+          <w:i w:val="0"/>
+          <w:color w:val="555555"/>
+          <w:sz w:val="20"/>
+        </w:rPr>
+        <w:t>Cómo implementamos el Perfil de Google (paso a paso): 1) creamos y reclamamos el perfil; 2) lo verificamos con Google (video/teléfono/tarjeta postal); 3) elegimos la categoría correcta (contratista de pavimento / sealcoating) y definimos tu zona de servicio por ciudades; 4) cargamos servicios, descripción bilingüe, fotos, logo y horario de temporada; 5) conectamos tu teléfono y el sitio web; 6) instalamos el sistema de reseñas y publicamos las primeras. Todo el perfil es gratuito en Google; se cobra el trabajo de armarlo y optimizarlo.</w:t>
       </w:r>
     </w:p>
     <w:p>
@@ -974,11 +1025,24 @@
       <w:r>
         <w:rPr>
           <w:b w:val="0"/>
-          <w:i/>
-          <w:color w:val="555555"/>
-          <w:sz w:val="20"/>
+          <w:i w:val="0"/>
+          <w:color w:val="1A1A1A"/>
+          <w:sz w:val="22"/>
         </w:rPr>
-        <w:t>Las siguientes cantidades son de referencia y se confirman al aprobar el alcance. Los montos de terceros (dominio, correo, presupuesto de anuncios) se pagan directamente a los proveedores.</w:t>
+        <w:t>Para que quede totalmente claro qué pagas y a quién, separamos la inversión en dos partes: (A) los servicios profesionales que realiza Aimarktech, y (B) los costos de terceros que se contratan a nombre de tu negocio (dominio, correo, hospedaje y, si decides, anuncios).</w:t>
+      </w:r>
+    </w:p>
+    <w:p>
+      <w:pPr>
+        <w:spacing w:before="120" w:after="40"/>
+      </w:pPr>
+      <w:r>
+        <w:rPr>
+          <w:b/>
+          <w:color w:val="1A1A1A"/>
+          <w:sz w:val="24"/>
+        </w:rPr>
+        <w:t>A) Servicios profesionales (los realiza Aimarktech)</w:t>
       </w:r>
     </w:p>
     <w:tbl>
@@ -1059,60 +1123,6 @@
         <w:tc>
           <w:tcPr>
             <w:tcW w:type="dxa" w:w="3211"/>
-            <w:shd w:val="clear" w:color="auto" w:fill="F5C400"/>
-          </w:tcPr>
-          <w:p>
-            <w:r/>
-            <w:r>
-              <w:rPr>
-                <w:rFonts w:ascii="Calibri" w:hAnsi="Calibri"/>
-                <w:b/>
-                <w:color w:val="1A1A1A"/>
-                <w:sz w:val="21"/>
-              </w:rPr>
-              <w:t>FASE 0 — Cimientos</w:t>
-            </w:r>
-          </w:p>
-        </w:tc>
-        <w:tc>
-          <w:tcPr>
-            <w:tcW w:type="dxa" w:w="3211"/>
-            <w:shd w:val="clear" w:color="auto" w:fill="F5C400"/>
-          </w:tcPr>
-          <w:p>
-            <w:r/>
-            <w:r>
-              <w:rPr>
-                <w:rFonts w:ascii="Calibri" w:hAnsi="Calibri"/>
-                <w:b w:val="0"/>
-                <w:color w:val="1A1A1A"/>
-                <w:sz w:val="21"/>
-              </w:rPr>
-            </w:r>
-          </w:p>
-        </w:tc>
-        <w:tc>
-          <w:tcPr>
-            <w:tcW w:type="dxa" w:w="3211"/>
-            <w:shd w:val="clear" w:color="auto" w:fill="F5C400"/>
-          </w:tcPr>
-          <w:p>
-            <w:r/>
-            <w:r>
-              <w:rPr>
-                <w:rFonts w:ascii="Calibri" w:hAnsi="Calibri"/>
-                <w:b w:val="0"/>
-                <w:color w:val="1A1A1A"/>
-                <w:sz w:val="21"/>
-              </w:rPr>
-            </w:r>
-          </w:p>
-        </w:tc>
-      </w:tr>
-      <w:tr>
-        <w:tc>
-          <w:tcPr>
-            <w:tcW w:type="dxa" w:w="3211"/>
           </w:tcPr>
           <w:p>
             <w:r/>
@@ -1164,124 +1174,6 @@
                 <w:sz w:val="21"/>
               </w:rPr>
               <w:t>$120 – $180</w:t>
-            </w:r>
-          </w:p>
-        </w:tc>
-      </w:tr>
-      <w:tr>
-        <w:tc>
-          <w:tcPr>
-            <w:tcW w:type="dxa" w:w="3211"/>
-          </w:tcPr>
-          <w:p>
-            <w:r/>
-            <w:r>
-              <w:rPr>
-                <w:rFonts w:ascii="Calibri" w:hAnsi="Calibri"/>
-                <w:b w:val="0"/>
-                <w:color w:val="1A1A1A"/>
-                <w:sz w:val="21"/>
-              </w:rPr>
-              <w:t>Registro de dominio (1 año)</w:t>
-            </w:r>
-          </w:p>
-        </w:tc>
-        <w:tc>
-          <w:tcPr>
-            <w:tcW w:type="dxa" w:w="3211"/>
-          </w:tcPr>
-          <w:p>
-            <w:pPr>
-              <w:jc w:val="center"/>
-            </w:pPr>
-            <w:r/>
-            <w:r>
-              <w:rPr>
-                <w:rFonts w:ascii="Calibri" w:hAnsi="Calibri"/>
-                <w:b w:val="0"/>
-                <w:color w:val="1A1A1A"/>
-                <w:sz w:val="21"/>
-              </w:rPr>
-              <w:t>Anual</w:t>
-            </w:r>
-          </w:p>
-        </w:tc>
-        <w:tc>
-          <w:tcPr>
-            <w:tcW w:type="dxa" w:w="3211"/>
-          </w:tcPr>
-          <w:p>
-            <w:pPr>
-              <w:jc w:val="center"/>
-            </w:pPr>
-            <w:r/>
-            <w:r>
-              <w:rPr>
-                <w:rFonts w:ascii="Calibri" w:hAnsi="Calibri"/>
-                <w:b w:val="0"/>
-                <w:color w:val="1A1A1A"/>
-                <w:sz w:val="21"/>
-              </w:rPr>
-              <w:t>$15 – $25</w:t>
-            </w:r>
-          </w:p>
-        </w:tc>
-      </w:tr>
-      <w:tr>
-        <w:tc>
-          <w:tcPr>
-            <w:tcW w:type="dxa" w:w="3211"/>
-          </w:tcPr>
-          <w:p>
-            <w:r/>
-            <w:r>
-              <w:rPr>
-                <w:rFonts w:ascii="Calibri" w:hAnsi="Calibri"/>
-                <w:b w:val="0"/>
-                <w:color w:val="1A1A1A"/>
-                <w:sz w:val="21"/>
-              </w:rPr>
-              <w:t>Correo profesional (1 año)</w:t>
-            </w:r>
-          </w:p>
-        </w:tc>
-        <w:tc>
-          <w:tcPr>
-            <w:tcW w:type="dxa" w:w="3211"/>
-          </w:tcPr>
-          <w:p>
-            <w:pPr>
-              <w:jc w:val="center"/>
-            </w:pPr>
-            <w:r/>
-            <w:r>
-              <w:rPr>
-                <w:rFonts w:ascii="Calibri" w:hAnsi="Calibri"/>
-                <w:b w:val="0"/>
-                <w:color w:val="1A1A1A"/>
-                <w:sz w:val="21"/>
-              </w:rPr>
-              <w:t>Anual</w:t>
-            </w:r>
-          </w:p>
-        </w:tc>
-        <w:tc>
-          <w:tcPr>
-            <w:tcW w:type="dxa" w:w="3211"/>
-          </w:tcPr>
-          <w:p>
-            <w:pPr>
-              <w:jc w:val="center"/>
-            </w:pPr>
-            <w:r/>
-            <w:r>
-              <w:rPr>
-                <w:rFonts w:ascii="Calibri" w:hAnsi="Calibri"/>
-                <w:b w:val="0"/>
-                <w:color w:val="1A1A1A"/>
-                <w:sz w:val="21"/>
-              </w:rPr>
-              <w:t>$40 – $70</w:t>
             </w:r>
           </w:p>
         </w:tc>
@@ -1408,25 +1300,6 @@
         <w:tc>
           <w:tcPr>
             <w:tcW w:type="dxa" w:w="3211"/>
-            <w:shd w:val="clear" w:color="auto" w:fill="F5C400"/>
-          </w:tcPr>
-          <w:p>
-            <w:r/>
-            <w:r>
-              <w:rPr>
-                <w:rFonts w:ascii="Calibri" w:hAnsi="Calibri"/>
-                <w:b/>
-                <w:color w:val="1A1A1A"/>
-                <w:sz w:val="21"/>
-              </w:rPr>
-              <w:t>FASE 1 — Sitio web de conversión</w:t>
-            </w:r>
-          </w:p>
-        </w:tc>
-        <w:tc>
-          <w:tcPr>
-            <w:tcW w:type="dxa" w:w="3211"/>
-            <w:shd w:val="clear" w:color="auto" w:fill="F5C400"/>
           </w:tcPr>
           <w:p>
             <w:r/>
@@ -1437,42 +1310,7 @@
                 <w:color w:val="1A1A1A"/>
                 <w:sz w:val="21"/>
               </w:rPr>
-            </w:r>
-          </w:p>
-        </w:tc>
-        <w:tc>
-          <w:tcPr>
-            <w:tcW w:type="dxa" w:w="3211"/>
-            <w:shd w:val="clear" w:color="auto" w:fill="F5C400"/>
-          </w:tcPr>
-          <w:p>
-            <w:r/>
-            <w:r>
-              <w:rPr>
-                <w:rFonts w:ascii="Calibri" w:hAnsi="Calibri"/>
-                <w:b w:val="0"/>
-                <w:color w:val="1A1A1A"/>
-                <w:sz w:val="21"/>
-              </w:rPr>
-            </w:r>
-          </w:p>
-        </w:tc>
-      </w:tr>
-      <w:tr>
-        <w:tc>
-          <w:tcPr>
-            <w:tcW w:type="dxa" w:w="3211"/>
-          </w:tcPr>
-          <w:p>
-            <w:r/>
-            <w:r>
-              <w:rPr>
-                <w:rFonts w:ascii="Calibri" w:hAnsi="Calibri"/>
-                <w:b w:val="0"/>
-                <w:color w:val="1A1A1A"/>
-                <w:sz w:val="21"/>
-              </w:rPr>
-              <w:t>Sitio bilingüe (EN/ES) de conversión</w:t>
+              <w:t>Sitio web bilingüe (EN/ES) de conversión</w:t>
             </w:r>
           </w:p>
         </w:tc>
@@ -1531,120 +1369,7 @@
                 <w:color w:val="1A1A1A"/>
                 <w:sz w:val="21"/>
               </w:rPr>
-              <w:t>Hospedaje del sitio (Cloudflare Pages)</w:t>
-            </w:r>
-          </w:p>
-        </w:tc>
-        <w:tc>
-          <w:tcPr>
-            <w:tcW w:type="dxa" w:w="3211"/>
-          </w:tcPr>
-          <w:p>
-            <w:pPr>
-              <w:jc w:val="center"/>
-            </w:pPr>
-            <w:r/>
-            <w:r>
-              <w:rPr>
-                <w:rFonts w:ascii="Calibri" w:hAnsi="Calibri"/>
-                <w:b w:val="0"/>
-                <w:color w:val="1A1A1A"/>
-                <w:sz w:val="21"/>
-              </w:rPr>
-              <w:t>Anual</w:t>
-            </w:r>
-          </w:p>
-        </w:tc>
-        <w:tc>
-          <w:tcPr>
-            <w:tcW w:type="dxa" w:w="3211"/>
-          </w:tcPr>
-          <w:p>
-            <w:pPr>
-              <w:jc w:val="center"/>
-            </w:pPr>
-            <w:r/>
-            <w:r>
-              <w:rPr>
-                <w:rFonts w:ascii="Calibri" w:hAnsi="Calibri"/>
-                <w:b w:val="0"/>
-                <w:color w:val="1A1A1A"/>
-                <w:sz w:val="21"/>
-              </w:rPr>
-              <w:t>$0 – $60</w:t>
-            </w:r>
-          </w:p>
-        </w:tc>
-      </w:tr>
-      <w:tr>
-        <w:tc>
-          <w:tcPr>
-            <w:tcW w:type="dxa" w:w="3211"/>
-            <w:shd w:val="clear" w:color="auto" w:fill="F5C400"/>
-          </w:tcPr>
-          <w:p>
-            <w:r/>
-            <w:r>
-              <w:rPr>
-                <w:rFonts w:ascii="Calibri" w:hAnsi="Calibri"/>
-                <w:b/>
-                <w:color w:val="1A1A1A"/>
-                <w:sz w:val="21"/>
-              </w:rPr>
-              <w:t>FASE 2 — Crecimiento (opcional)</w:t>
-            </w:r>
-          </w:p>
-        </w:tc>
-        <w:tc>
-          <w:tcPr>
-            <w:tcW w:type="dxa" w:w="3211"/>
-            <w:shd w:val="clear" w:color="auto" w:fill="F5C400"/>
-          </w:tcPr>
-          <w:p>
-            <w:r/>
-            <w:r>
-              <w:rPr>
-                <w:rFonts w:ascii="Calibri" w:hAnsi="Calibri"/>
-                <w:b w:val="0"/>
-                <w:color w:val="1A1A1A"/>
-                <w:sz w:val="21"/>
-              </w:rPr>
-            </w:r>
-          </w:p>
-        </w:tc>
-        <w:tc>
-          <w:tcPr>
-            <w:tcW w:type="dxa" w:w="3211"/>
-            <w:shd w:val="clear" w:color="auto" w:fill="F5C400"/>
-          </w:tcPr>
-          <w:p>
-            <w:r/>
-            <w:r>
-              <w:rPr>
-                <w:rFonts w:ascii="Calibri" w:hAnsi="Calibri"/>
-                <w:b w:val="0"/>
-                <w:color w:val="1A1A1A"/>
-                <w:sz w:val="21"/>
-              </w:rPr>
-            </w:r>
-          </w:p>
-        </w:tc>
-      </w:tr>
-      <w:tr>
-        <w:tc>
-          <w:tcPr>
-            <w:tcW w:type="dxa" w:w="3211"/>
-          </w:tcPr>
-          <w:p>
-            <w:r/>
-            <w:r>
-              <w:rPr>
-                <w:rFonts w:ascii="Calibri" w:hAnsi="Calibri"/>
-                <w:b w:val="0"/>
-                <w:color w:val="1A1A1A"/>
-                <w:sz w:val="21"/>
-              </w:rPr>
-              <w:t>Gestión de anuncios (mensual)</w:t>
+              <w:t>Gestión de anuncios (opcional, Fase 2)</w:t>
             </w:r>
           </w:p>
         </w:tc>
@@ -1689,6 +1414,108 @@
           </w:p>
         </w:tc>
       </w:tr>
+    </w:tbl>
+    <w:p>
+      <w:pPr>
+        <w:spacing w:after="120"/>
+      </w:pPr>
+      <w:r>
+        <w:rPr>
+          <w:b w:val="0"/>
+          <w:i w:val="0"/>
+          <w:color w:val="555555"/>
+          <w:sz w:val="20"/>
+        </w:rPr>
+        <w:t>Son honorarios por el trabajo profesional. El Perfil de Empresa en Google es gratuito por parte de Google; lo que se cobra es la creación, verificación y optimización del perfil.</w:t>
+      </w:r>
+    </w:p>
+    <w:p>
+      <w:pPr>
+        <w:spacing w:before="120" w:after="40"/>
+      </w:pPr>
+      <w:r>
+        <w:rPr>
+          <w:b/>
+          <w:color w:val="1A1A1A"/>
+          <w:sz w:val="24"/>
+        </w:rPr>
+        <w:t>B) Costos de terceros (a nombre de tu negocio)</w:t>
+      </w:r>
+    </w:p>
+    <w:tbl>
+      <w:tblPr>
+        <w:tblStyle w:val="TableGrid"/>
+        <w:tblW w:type="auto" w:w="0"/>
+        <w:jc w:val="center"/>
+        <w:tblLook w:firstColumn="1" w:firstRow="1" w:lastColumn="0" w:lastRow="0" w:noHBand="0" w:noVBand="1" w:val="04A0"/>
+      </w:tblPr>
+      <w:tblGrid>
+        <w:gridCol w:w="3211"/>
+        <w:gridCol w:w="3211"/>
+        <w:gridCol w:w="3211"/>
+      </w:tblGrid>
+      <w:tr>
+        <w:tc>
+          <w:tcPr>
+            <w:tcW w:type="dxa" w:w="3211"/>
+            <w:shd w:val="clear" w:color="auto" w:fill="1A1A1A"/>
+          </w:tcPr>
+          <w:p>
+            <w:r/>
+            <w:r>
+              <w:rPr>
+                <w:rFonts w:ascii="Calibri" w:hAnsi="Calibri"/>
+                <w:b/>
+                <w:color w:val="FFFFFF"/>
+                <w:sz w:val="22"/>
+              </w:rPr>
+              <w:t>Concepto</w:t>
+            </w:r>
+          </w:p>
+        </w:tc>
+        <w:tc>
+          <w:tcPr>
+            <w:tcW w:type="dxa" w:w="3211"/>
+            <w:shd w:val="clear" w:color="auto" w:fill="1A1A1A"/>
+          </w:tcPr>
+          <w:p>
+            <w:pPr>
+              <w:jc w:val="center"/>
+            </w:pPr>
+            <w:r/>
+            <w:r>
+              <w:rPr>
+                <w:rFonts w:ascii="Calibri" w:hAnsi="Calibri"/>
+                <w:b/>
+                <w:color w:val="FFFFFF"/>
+                <w:sz w:val="22"/>
+              </w:rPr>
+              <w:t>Tipo</w:t>
+            </w:r>
+          </w:p>
+        </w:tc>
+        <w:tc>
+          <w:tcPr>
+            <w:tcW w:type="dxa" w:w="3211"/>
+            <w:shd w:val="clear" w:color="auto" w:fill="1A1A1A"/>
+          </w:tcPr>
+          <w:p>
+            <w:pPr>
+              <w:jc w:val="center"/>
+            </w:pPr>
+            <w:r/>
+            <w:r>
+              <w:rPr>
+                <w:rFonts w:ascii="Calibri" w:hAnsi="Calibri"/>
+                <w:b/>
+                <w:color w:val="FFFFFF"/>
+                <w:sz w:val="22"/>
+              </w:rPr>
+              <w:t>Costo (USD)</w:t>
+            </w:r>
+          </w:p>
+        </w:tc>
+      </w:tr>
       <w:tr>
         <w:tc>
           <w:tcPr>
@@ -1703,7 +1530,243 @@
                 <w:color w:val="1A1A1A"/>
                 <w:sz w:val="21"/>
               </w:rPr>
-              <w:t>Presupuesto de anuncios (se paga a Google/Meta)</w:t>
+              <w:t>Dominio .com (registrador a costo, ej. Cloudflare)</w:t>
+            </w:r>
+          </w:p>
+        </w:tc>
+        <w:tc>
+          <w:tcPr>
+            <w:tcW w:type="dxa" w:w="3211"/>
+          </w:tcPr>
+          <w:p>
+            <w:pPr>
+              <w:jc w:val="center"/>
+            </w:pPr>
+            <w:r/>
+            <w:r>
+              <w:rPr>
+                <w:rFonts w:ascii="Calibri" w:hAnsi="Calibri"/>
+                <w:b w:val="0"/>
+                <w:color w:val="1A1A1A"/>
+                <w:sz w:val="21"/>
+              </w:rPr>
+              <w:t>Anual</w:t>
+            </w:r>
+          </w:p>
+        </w:tc>
+        <w:tc>
+          <w:tcPr>
+            <w:tcW w:type="dxa" w:w="3211"/>
+          </w:tcPr>
+          <w:p>
+            <w:pPr>
+              <w:jc w:val="center"/>
+            </w:pPr>
+            <w:r/>
+            <w:r>
+              <w:rPr>
+                <w:rFonts w:ascii="Calibri" w:hAnsi="Calibri"/>
+                <w:b w:val="0"/>
+                <w:color w:val="1A1A1A"/>
+                <w:sz w:val="21"/>
+              </w:rPr>
+              <w:t>$10 – $15</w:t>
+            </w:r>
+          </w:p>
+        </w:tc>
+      </w:tr>
+      <w:tr>
+        <w:tc>
+          <w:tcPr>
+            <w:tcW w:type="dxa" w:w="3211"/>
+          </w:tcPr>
+          <w:p>
+            <w:r/>
+            <w:r>
+              <w:rPr>
+                <w:rFonts w:ascii="Calibri" w:hAnsi="Calibri"/>
+                <w:b w:val="0"/>
+                <w:color w:val="1A1A1A"/>
+                <w:sz w:val="21"/>
+              </w:rPr>
+              <w:t>Correo profesional (opción sin costo mensual)</w:t>
+            </w:r>
+          </w:p>
+        </w:tc>
+        <w:tc>
+          <w:tcPr>
+            <w:tcW w:type="dxa" w:w="3211"/>
+          </w:tcPr>
+          <w:p>
+            <w:pPr>
+              <w:jc w:val="center"/>
+            </w:pPr>
+            <w:r/>
+            <w:r>
+              <w:rPr>
+                <w:rFonts w:ascii="Calibri" w:hAnsi="Calibri"/>
+                <w:b w:val="0"/>
+                <w:color w:val="1A1A1A"/>
+                <w:sz w:val="21"/>
+              </w:rPr>
+              <w:t>Anual</w:t>
+            </w:r>
+          </w:p>
+        </w:tc>
+        <w:tc>
+          <w:tcPr>
+            <w:tcW w:type="dxa" w:w="3211"/>
+          </w:tcPr>
+          <w:p>
+            <w:pPr>
+              <w:jc w:val="center"/>
+            </w:pPr>
+            <w:r/>
+            <w:r>
+              <w:rPr>
+                <w:rFonts w:ascii="Calibri" w:hAnsi="Calibri"/>
+                <w:b w:val="0"/>
+                <w:color w:val="1A1A1A"/>
+                <w:sz w:val="21"/>
+              </w:rPr>
+              <w:t>$0</w:t>
+            </w:r>
+          </w:p>
+        </w:tc>
+      </w:tr>
+      <w:tr>
+        <w:tc>
+          <w:tcPr>
+            <w:tcW w:type="dxa" w:w="3211"/>
+          </w:tcPr>
+          <w:p>
+            <w:r/>
+            <w:r>
+              <w:rPr>
+                <w:rFonts w:ascii="Calibri" w:hAnsi="Calibri"/>
+                <w:b w:val="0"/>
+                <w:color w:val="1A1A1A"/>
+                <w:sz w:val="21"/>
+              </w:rPr>
+              <w:t>Correo con buzón completo (Google Workspace, opcional)</w:t>
+            </w:r>
+          </w:p>
+        </w:tc>
+        <w:tc>
+          <w:tcPr>
+            <w:tcW w:type="dxa" w:w="3211"/>
+          </w:tcPr>
+          <w:p>
+            <w:pPr>
+              <w:jc w:val="center"/>
+            </w:pPr>
+            <w:r/>
+            <w:r>
+              <w:rPr>
+                <w:rFonts w:ascii="Calibri" w:hAnsi="Calibri"/>
+                <w:b w:val="0"/>
+                <w:color w:val="1A1A1A"/>
+                <w:sz w:val="21"/>
+              </w:rPr>
+              <w:t>Mensual</w:t>
+            </w:r>
+          </w:p>
+        </w:tc>
+        <w:tc>
+          <w:tcPr>
+            <w:tcW w:type="dxa" w:w="3211"/>
+          </w:tcPr>
+          <w:p>
+            <w:pPr>
+              <w:jc w:val="center"/>
+            </w:pPr>
+            <w:r/>
+            <w:r>
+              <w:rPr>
+                <w:rFonts w:ascii="Calibri" w:hAnsi="Calibri"/>
+                <w:b w:val="0"/>
+                <w:color w:val="1A1A1A"/>
+                <w:sz w:val="21"/>
+              </w:rPr>
+              <w:t>≈ $7 / mes</w:t>
+            </w:r>
+          </w:p>
+        </w:tc>
+      </w:tr>
+      <w:tr>
+        <w:tc>
+          <w:tcPr>
+            <w:tcW w:type="dxa" w:w="3211"/>
+          </w:tcPr>
+          <w:p>
+            <w:r/>
+            <w:r>
+              <w:rPr>
+                <w:rFonts w:ascii="Calibri" w:hAnsi="Calibri"/>
+                <w:b w:val="0"/>
+                <w:color w:val="1A1A1A"/>
+                <w:sz w:val="21"/>
+              </w:rPr>
+              <w:t>Hospedaje del sitio (Cloudflare Pages)</w:t>
+            </w:r>
+          </w:p>
+        </w:tc>
+        <w:tc>
+          <w:tcPr>
+            <w:tcW w:type="dxa" w:w="3211"/>
+          </w:tcPr>
+          <w:p>
+            <w:pPr>
+              <w:jc w:val="center"/>
+            </w:pPr>
+            <w:r/>
+            <w:r>
+              <w:rPr>
+                <w:rFonts w:ascii="Calibri" w:hAnsi="Calibri"/>
+                <w:b w:val="0"/>
+                <w:color w:val="1A1A1A"/>
+                <w:sz w:val="21"/>
+              </w:rPr>
+              <w:t>—</w:t>
+            </w:r>
+          </w:p>
+        </w:tc>
+        <w:tc>
+          <w:tcPr>
+            <w:tcW w:type="dxa" w:w="3211"/>
+          </w:tcPr>
+          <w:p>
+            <w:pPr>
+              <w:jc w:val="center"/>
+            </w:pPr>
+            <w:r/>
+            <w:r>
+              <w:rPr>
+                <w:rFonts w:ascii="Calibri" w:hAnsi="Calibri"/>
+                <w:b w:val="0"/>
+                <w:color w:val="1A1A1A"/>
+                <w:sz w:val="21"/>
+              </w:rPr>
+              <w:t>$0 (gratis)</w:t>
+            </w:r>
+          </w:p>
+        </w:tc>
+      </w:tr>
+      <w:tr>
+        <w:tc>
+          <w:tcPr>
+            <w:tcW w:type="dxa" w:w="3211"/>
+          </w:tcPr>
+          <w:p>
+            <w:r/>
+            <w:r>
+              <w:rPr>
+                <w:rFonts w:ascii="Calibri" w:hAnsi="Calibri"/>
+                <w:b w:val="0"/>
+                <w:color w:val="1A1A1A"/>
+                <w:sz w:val="21"/>
+              </w:rPr>
+              <w:t>Presupuesto de anuncios (opcional, Fase 2)</w:t>
             </w:r>
           </w:p>
         </w:tc>
@@ -1749,7 +1812,6 @@
         </w:tc>
       </w:tr>
     </w:tbl>
-    <w:p/>
     <w:p>
       <w:pPr>
         <w:spacing w:after="120"/>
@@ -1761,7 +1823,21 @@
           <w:color w:val="555555"/>
           <w:sz w:val="20"/>
         </w:rPr>
-        <w:t>* Rangos de referencia ajustables por Aimarktech. Recomendación: comenzar con Fase 0 + Fase 1, que es la base que genera resultados con la inversión más contenida.</w:t>
+        <w:t>El hospedaje en Cloudflare Pages es gratuito (igual que en nuestros otros proyectos). El correo profesional lo dejamos sin costo mensual usando reenvío hacia tu correo actual; solo si prefieres un buzón completo tipo Google Workspace habría una mensualidad.</w:t>
+      </w:r>
+    </w:p>
+    <w:p>
+      <w:pPr>
+        <w:spacing w:after="120"/>
+      </w:pPr>
+      <w:r>
+        <w:rPr>
+          <w:b w:val="0"/>
+          <w:i w:val="0"/>
+          <w:color w:val="555555"/>
+          <w:sz w:val="20"/>
+        </w:rPr>
+        <w:t>* Rangos de referencia ajustables. Recomendación: comenzar con el paquete Fase 0 + Fase 1.</w:t>
       </w:r>
     </w:p>
     <w:p>
@@ -1800,7 +1876,7 @@
                 <w:color w:val="1A1A1A"/>
                 <w:sz w:val="21"/>
               </w:rPr>
-              <w:t>Fase 0 + Fase 1 (logo, dominio, correo, Google Business Profile, sistema de reseñas y sitio bilingüe de conversión). Es el conjunto mínimo que te hace visible y convierte visitas en llamadas.</w:t>
+              <w:t>Fase 0 + Fase 1: logo, Perfil de Empresa en Google, sistema de reseñas y sitio bilingüe de conversión. Costos de terceros mínimos: solo el dominio (~$10–$15 al año); correo y hospedaje sin costo mensual. Es el conjunto mínimo que te hace visible y convierte visitas en llamadas.</w:t>
             </w:r>
           </w:p>
         </w:tc>
@@ -1931,6 +2007,42 @@
         <w:rPr>
           <w:sz w:val="22"/>
         </w:rPr>
+        <w:t>El nombre de dominio que prefieres (por ejemplo, lopezsealcoating.com), para registrarlo a tu nombre.</w:t>
+      </w:r>
+    </w:p>
+    <w:p>
+      <w:pPr>
+        <w:pStyle w:val="ListBullet"/>
+        <w:spacing w:after="60"/>
+      </w:pPr>
+      <w:r>
+        <w:rPr>
+          <w:sz w:val="22"/>
+        </w:rPr>
+        <w:t>Confirmar el teléfono que se mostrará al público (actualmente 331-236-9387).</w:t>
+      </w:r>
+    </w:p>
+    <w:p>
+      <w:pPr>
+        <w:pStyle w:val="ListBullet"/>
+        <w:spacing w:after="60"/>
+      </w:pPr>
+      <w:r>
+        <w:rPr>
+          <w:sz w:val="22"/>
+        </w:rPr>
+        <w:t>El correo personal donde quieres recibir los mensajes MIENTRAS configuramos tu correo profesional nuevo.</w:t>
+      </w:r>
+    </w:p>
+    <w:p>
+      <w:pPr>
+        <w:pStyle w:val="ListBullet"/>
+        <w:spacing w:after="60"/>
+      </w:pPr>
+      <w:r>
+        <w:rPr>
+          <w:sz w:val="22"/>
+        </w:rPr>
         <w:t>Tus fotos y videos de trabajos terminados en buena calidad.</w:t>
       </w:r>
     </w:p>
@@ -1956,18 +2068,6 @@
           <w:sz w:val="22"/>
         </w:rPr>
         <w:t>Las ciudades/zonas donde más te interesa conseguir clientes.</w:t>
-      </w:r>
-    </w:p>
-    <w:p>
-      <w:pPr>
-        <w:pStyle w:val="ListBullet"/>
-        <w:spacing w:after="60"/>
-      </w:pPr>
-      <w:r>
-        <w:rPr>
-          <w:sz w:val="22"/>
-        </w:rPr>
-        <w:t>Tu teléfono y correo definitivos para el contacto público.</w:t>
       </w:r>
     </w:p>
     <w:tbl>
@@ -2199,6 +2299,58 @@
       </w:tr>
     </w:tbl>
     <w:p/>
+    <w:p>
+      <w:pPr>
+        <w:spacing w:after="200"/>
+      </w:pPr>
+      <w:r>
+        <w:rPr>
+          <w:b w:val="0"/>
+          <w:i w:val="0"/>
+          <w:color w:val="1A1A1A"/>
+          <w:sz w:val="22"/>
+        </w:rPr>
+        <w:t>Atentamente,</w:t>
+      </w:r>
+    </w:p>
+    <w:p>
+      <w:pPr>
+        <w:spacing w:after="0"/>
+      </w:pPr>
+      <w:r>
+        <w:rPr>
+          <w:b/>
+          <w:color w:val="1A1A1A"/>
+          <w:sz w:val="25"/>
+        </w:rPr>
+        <w:t>Antonio Aguilar</w:t>
+      </w:r>
+    </w:p>
+    <w:p>
+      <w:pPr>
+        <w:spacing w:after="0"/>
+      </w:pPr>
+      <w:r>
+        <w:rPr>
+          <w:color w:val="555555"/>
+          <w:sz w:val="22"/>
+        </w:rPr>
+        <w:t>CEO · Aimarktech</w:t>
+      </w:r>
+    </w:p>
+    <w:p>
+      <w:pPr>
+        <w:spacing w:after="200"/>
+      </w:pPr>
+      <w:r>
+        <w:rPr>
+          <w:b/>
+          <w:color w:val="1A1A1A"/>
+          <w:sz w:val="22"/>
+        </w:rPr>
+        <w:t>https://soyaimarktech.com</w:t>
+      </w:r>
+    </w:p>
     <w:tbl>
       <w:tblPr>
         <w:tblW w:type="auto" w:w="0"/>
@@ -2229,7 +2381,7 @@
           </w:p>
           <w:p>
             <w:pPr>
-              <w:spacing w:after="160"/>
+              <w:spacing w:after="40"/>
               <w:jc w:val="center"/>
             </w:pPr>
             <w:r>
@@ -2238,6 +2390,20 @@
                 <w:sz w:val="21"/>
               </w:rPr>
               <w:t>Gracias por tu confianza. Estamos listos para hacer crecer Lopez Sealcoating.</w:t>
+            </w:r>
+          </w:p>
+          <w:p>
+            <w:pPr>
+              <w:spacing w:after="160"/>
+              <w:jc w:val="center"/>
+            </w:pPr>
+            <w:r>
+              <w:rPr>
+                <w:b/>
+                <w:color w:val="F5C400"/>
+                <w:sz w:val="21"/>
+              </w:rPr>
+              <w:t>www.soyaimarktech.com</w:t>
             </w:r>
           </w:p>
         </w:tc>

</xml_diff>